<commit_message>
update màu nút Xóa của file cart.php
</commit_message>
<xml_diff>
--- a/Yuumishop.docx
+++ b/Yuumishop.docx
@@ -157,10 +157,7 @@
         <w:t>edit_user</w:t>
       </w:r>
       <w:r>
-        <w:t xml:space="preserve">.php       # </w:t>
-      </w:r>
-      <w:r>
-        <w:t>Chỉnh sửa user</w:t>
+        <w:t>.php       # Chỉnh sửa user</w:t>
       </w:r>
     </w:p>
     <w:p>
@@ -4120,7 +4117,7 @@
     </w:p>
     <w:p>
       <w:r>
-        <w:t>$shipping = 0; // Miễn phí ship (có thể chỉnh logic tính phí ở đây)</w:t>
+        <w:t xml:space="preserve">$shipping = 0; </w:t>
       </w:r>
     </w:p>
     <w:p>
@@ -4128,18 +4125,86 @@
         <w:t>$total = $subtotal + $shipping;</w:t>
       </w:r>
     </w:p>
-    <w:p>
-      <w:r>
+    <w:p/>
+    <w:p>
+      <w:r>
+        <w:t>// TÍNH TOÁN GIỚI HẠN DÙNG ĐIỂM (Safe Mode)</w:t>
+      </w:r>
+    </w:p>
+    <w:p>
+      <w:r>
+        <w:t>// 1 điểm = 100đ.</w:t>
+      </w:r>
+    </w:p>
+    <w:p>
+      <w:r>
+        <w:t>// Tối đa giảm 20% giá trị đơn hàng.</w:t>
+      </w:r>
+    </w:p>
+    <w:p>
+      <w:r>
+        <w:t>$max_discount_vnd = $total * 0.20; // 20% tổng đơn</w:t>
+      </w:r>
+    </w:p>
+    <w:p>
+      <w:r>
+        <w:t>$max_points_allowed = floor($max_discount_vnd / 100); // Đổi ra số điểm tối đa được dùng</w:t>
+      </w:r>
+    </w:p>
+    <w:p/>
+    <w:p>
+      <w:r>
+        <w:t>// Số điểm khách thực tế có thể dùng (Min của: điểm đang có VÀ giới hạn cho phép)</w:t>
+      </w:r>
+    </w:p>
+    <w:p>
+      <w:r>
+        <w:t>$usable_points = min($user['points'], $max_points_allowed);</w:t>
+      </w:r>
+    </w:p>
+    <w:p>
+      <w:pPr>
+        <w:rPr>
+          <w:lang w:val="nl-NL"/>
+        </w:rPr>
+      </w:pPr>
+      <w:r>
+        <w:rPr>
+          <w:lang w:val="nl-NL"/>
+        </w:rPr>
         <w:t>?&gt;</w:t>
       </w:r>
     </w:p>
     <w:p>
-      <w:r>
+      <w:pPr>
+        <w:rPr>
+          <w:lang w:val="nl-NL"/>
+        </w:rPr>
+      </w:pPr>
+    </w:p>
+    <w:p>
+      <w:pPr>
+        <w:rPr>
+          <w:lang w:val="nl-NL"/>
+        </w:rPr>
+      </w:pPr>
+      <w:r>
+        <w:rPr>
+          <w:lang w:val="nl-NL"/>
+        </w:rPr>
         <w:t>&lt;!DOCTYPE html&gt;</w:t>
       </w:r>
     </w:p>
     <w:p>
-      <w:r>
+      <w:pPr>
+        <w:rPr>
+          <w:lang w:val="nl-NL"/>
+        </w:rPr>
+      </w:pPr>
+      <w:r>
+        <w:rPr>
+          <w:lang w:val="nl-NL"/>
+        </w:rPr>
         <w:t>&lt;html lang="vi"&gt;</w:t>
       </w:r>
     </w:p>
@@ -4647,7 +4712,52 @@
     </w:p>
     <w:p>
       <w:r>
-        <w:t>            &lt;div class="points-section" style="margin: 15px 0; padding: 10px; background: #fff3cd; border-radius: 5px;"&gt;</w:t>
+        <w:t>            &lt;div class="points-section" style="margin: 15px 0; padding: 15px; background: #fff3cd; border-radius: 5px; border: 1px solid #ffeeba;"&gt;</w:t>
+      </w:r>
+    </w:p>
+    <w:p>
+      <w:r>
+        <w:t>                &lt;div style="font-weight: bold; color: #856404; margin-bottom: 5px;"&gt;</w:t>
+      </w:r>
+    </w:p>
+    <w:p>
+      <w:r>
+        <w:t>                    &lt;i class="fas fa-coins"&gt;&lt;/i&gt; Yuumi Points</w:t>
+      </w:r>
+    </w:p>
+    <w:p>
+      <w:r>
+        <w:t>                &lt;/div&gt;</w:t>
+      </w:r>
+    </w:p>
+    <w:p>
+      <w:r>
+        <w:t>                &lt;p style="font-size: 13px; margin-bottom: 10px;"&gt;</w:t>
+      </w:r>
+    </w:p>
+    <w:p>
+      <w:r>
+        <w:t xml:space="preserve">                    Bạn có &lt;strong&gt;&lt;?= number_format($user['points']) ?&gt;&lt;/strong&gt; điểm. </w:t>
+      </w:r>
+    </w:p>
+    <w:p>
+      <w:r>
+        <w:t>                    (1 điểm = 100đ). &lt;br&gt;</w:t>
+      </w:r>
+    </w:p>
+    <w:p>
+      <w:r>
+        <w:t>                    Tối đa được dùng: &lt;strong&gt;&lt;?= number_format($usable_points) ?&gt;&lt;/strong&gt; điểm cho đơn này (Max 20%).</w:t>
+      </w:r>
+    </w:p>
+    <w:p>
+      <w:r>
+        <w:t>                &lt;/p&gt;</w:t>
+      </w:r>
+    </w:p>
+    <w:p>
+      <w:r>
+        <w:t xml:space="preserve">                </w:t>
       </w:r>
     </w:p>
     <w:p>
@@ -4662,7 +4772,22 @@
     </w:p>
     <w:p>
       <w:r>
-        <w:t>                    &lt;span style="margin-left: 10px; font-size: 14px;"&gt;Dùng &lt;strong&gt;&lt;?= $user['points'] ?&gt;&lt;/strong&gt; điểm (Giảm &lt;?= number_format($user['points'] * 1000) ?&gt;đ)&lt;/span&gt;</w:t>
+        <w:t>                    &lt;span style="margin-left: 10px; font-size: 14px;"&gt;</w:t>
+      </w:r>
+    </w:p>
+    <w:p>
+      <w:r>
+        <w:t xml:space="preserve">                        Dùng &lt;strong&gt;&lt;?= $usable_points ?&gt;&lt;/strong&gt; điểm </w:t>
+      </w:r>
+    </w:p>
+    <w:p>
+      <w:r>
+        <w:t>                        (Giảm &lt;span style="color:red"&gt;-&lt;?= number_format($usable_points * 100) ?&gt;đ&lt;/span&gt;)</w:t>
+      </w:r>
+    </w:p>
+    <w:p>
+      <w:r>
+        <w:t>                    &lt;/span&gt;</w:t>
       </w:r>
     </w:p>
     <w:p>
@@ -4683,17 +4808,254 @@
     <w:p/>
     <w:p>
       <w:r>
-        <w:t>            &lt;div class="total-row"&gt;</w:t>
-      </w:r>
-    </w:p>
-    <w:p>
-      <w:r>
-        <w:t>                &lt;span&gt;Tổng cộng&lt;/span&gt;</w:t>
-      </w:r>
-    </w:p>
-    <w:p>
-      <w:r>
-        <w:t>                &lt;span class="total-price" id="totalDisplay"&gt;&lt;?= number_format($total) ?&gt; VND&lt;/span&gt;</w:t>
+        <w:t>            &lt;script&gt;</w:t>
+      </w:r>
+    </w:p>
+    <w:p>
+      <w:r>
+        <w:t xml:space="preserve">                </w:t>
+      </w:r>
+      <w:r>
+        <w:rPr>
+          <w:i/>
+          <w:iCs/>
+        </w:rPr>
+        <w:t>const</w:t>
+      </w:r>
+      <w:r>
+        <w:t xml:space="preserve"> originalTotal = &lt;?= $total ?&gt;;</w:t>
+      </w:r>
+    </w:p>
+    <w:p>
+      <w:r>
+        <w:t>                // Lấy số điểm đã tính toán giới hạn từ PHP</w:t>
+      </w:r>
+    </w:p>
+    <w:p>
+      <w:r>
+        <w:t xml:space="preserve">                </w:t>
+      </w:r>
+      <w:r>
+        <w:rPr>
+          <w:i/>
+          <w:iCs/>
+        </w:rPr>
+        <w:t>const</w:t>
+      </w:r>
+      <w:r>
+        <w:t xml:space="preserve"> usablePoints = &lt;?= isset($usable_points) ? $usable_points : 0 ?&gt;; </w:t>
+      </w:r>
+    </w:p>
+    <w:p>
+      <w:r>
+        <w:t xml:space="preserve">                </w:t>
+      </w:r>
+      <w:r>
+        <w:rPr>
+          <w:i/>
+          <w:iCs/>
+        </w:rPr>
+        <w:t>const</w:t>
+      </w:r>
+      <w:r>
+        <w:t xml:space="preserve"> pointValue = 100; // 1 điểm = 100đ (Logic mới)</w:t>
+      </w:r>
+    </w:p>
+    <w:p/>
+    <w:p>
+      <w:r>
+        <w:t xml:space="preserve">                </w:t>
+      </w:r>
+      <w:r>
+        <w:rPr>
+          <w:i/>
+          <w:iCs/>
+        </w:rPr>
+        <w:t>function</w:t>
+      </w:r>
+      <w:r>
+        <w:t xml:space="preserve"> updateTotal() {</w:t>
+      </w:r>
+    </w:p>
+    <w:p>
+      <w:r>
+        <w:t xml:space="preserve">                    </w:t>
+      </w:r>
+      <w:r>
+        <w:rPr>
+          <w:i/>
+          <w:iCs/>
+        </w:rPr>
+        <w:t>const</w:t>
+      </w:r>
+      <w:r>
+        <w:t xml:space="preserve"> checkbox = document.getElementById('usePoints');</w:t>
+      </w:r>
+    </w:p>
+    <w:p>
+      <w:r>
+        <w:t xml:space="preserve">                    </w:t>
+      </w:r>
+      <w:r>
+        <w:rPr>
+          <w:i/>
+          <w:iCs/>
+        </w:rPr>
+        <w:t>const</w:t>
+      </w:r>
+      <w:r>
+        <w:t xml:space="preserve"> totalDisplay = document.getElementById('totalDisplay');</w:t>
+      </w:r>
+    </w:p>
+    <w:p>
+      <w:r>
+        <w:t xml:space="preserve">                    </w:t>
+      </w:r>
+      <w:r>
+        <w:rPr>
+          <w:i/>
+          <w:iCs/>
+        </w:rPr>
+        <w:t>const</w:t>
+      </w:r>
+      <w:r>
+        <w:t xml:space="preserve"> totalInput = document.getElementById('totalInput');</w:t>
+      </w:r>
+    </w:p>
+    <w:p>
+      <w:r>
+        <w:t xml:space="preserve">                    </w:t>
+      </w:r>
+      <w:r>
+        <w:rPr>
+          <w:i/>
+          <w:iCs/>
+        </w:rPr>
+        <w:t>const</w:t>
+      </w:r>
+      <w:r>
+        <w:t xml:space="preserve"> pointsInput = document.getElementById('pointsInput');</w:t>
+      </w:r>
+    </w:p>
+    <w:p/>
+    <w:p>
+      <w:r>
+        <w:t>                    if (checkbox &amp;&amp; checkbox.checked) {</w:t>
+      </w:r>
+    </w:p>
+    <w:p>
+      <w:r>
+        <w:t xml:space="preserve">                        </w:t>
+      </w:r>
+      <w:r>
+        <w:rPr>
+          <w:i/>
+          <w:iCs/>
+        </w:rPr>
+        <w:t>const</w:t>
+      </w:r>
+      <w:r>
+        <w:t xml:space="preserve"> discount = usablePoints * pointValue;</w:t>
+      </w:r>
+    </w:p>
+    <w:p>
+      <w:r>
+        <w:t xml:space="preserve">                        </w:t>
+      </w:r>
+      <w:r>
+        <w:rPr>
+          <w:i/>
+          <w:iCs/>
+        </w:rPr>
+        <w:t>const</w:t>
+      </w:r>
+      <w:r>
+        <w:t xml:space="preserve"> newTotal = originalTotal - discount;</w:t>
+      </w:r>
+    </w:p>
+    <w:p>
+      <w:r>
+        <w:t xml:space="preserve">                        </w:t>
+      </w:r>
+    </w:p>
+    <w:p>
+      <w:r>
+        <w:t>                        // Format tiền Việt Nam</w:t>
+      </w:r>
+    </w:p>
+    <w:p>
+      <w:r>
+        <w:t>                        totalDisplay.innerHTML = new Intl.NumberFormat('vi-VN').format(newTotal) + ' VND';</w:t>
+      </w:r>
+    </w:p>
+    <w:p>
+      <w:r>
+        <w:t>                        totalDisplay.innerHTML += ` &lt;br&gt;&lt;small style='color:green; font-size:12px'&gt;(Đã giảm ${new Intl.NumberFormat('vi-VN').format(discount)}đ)&lt;/small&gt;`;</w:t>
+      </w:r>
+    </w:p>
+    <w:p>
+      <w:r>
+        <w:t xml:space="preserve">                        </w:t>
+      </w:r>
+    </w:p>
+    <w:p>
+      <w:r>
+        <w:t>                        totalInput.value = newTotal;</w:t>
+      </w:r>
+    </w:p>
+    <w:p>
+      <w:r>
+        <w:t>                        pointsInput.value = usablePoints; // Gửi số điểm thực dùng về server</w:t>
+      </w:r>
+    </w:p>
+    <w:p>
+      <w:r>
+        <w:t>                    } else {</w:t>
+      </w:r>
+    </w:p>
+    <w:p>
+      <w:r>
+        <w:t>                        totalDisplay.innerHTML = new Intl.NumberFormat('vi-VN').format(originalTotal) + ' VND';</w:t>
+      </w:r>
+    </w:p>
+    <w:p>
+      <w:r>
+        <w:t>                        totalInput.value = originalTotal;</w:t>
+      </w:r>
+    </w:p>
+    <w:p>
+      <w:r>
+        <w:t>                        pointsInput.value = 0;</w:t>
+      </w:r>
+    </w:p>
+    <w:p>
+      <w:r>
+        <w:t>                    }</w:t>
+      </w:r>
+    </w:p>
+    <w:p>
+      <w:r>
+        <w:t>                }</w:t>
+      </w:r>
+    </w:p>
+    <w:p>
+      <w:r>
+        <w:t>            &lt;/script&gt;</w:t>
+      </w:r>
+    </w:p>
+    <w:p>
+      <w:r>
+        <w:t xml:space="preserve">            </w:t>
+      </w:r>
+    </w:p>
+    <w:p>
+      <w:r>
+        <w:t>            &lt;div style="margin-top: 15px; text-align: center; font-size: 12px; color: #888;"&gt;</w:t>
+      </w:r>
+    </w:p>
+    <w:p>
+      <w:r>
+        <w:t>                Bằng việc đặt hàng, bạn đồng ý với &lt;a href="#" style="color: #2ecc71;"&gt;Điều khoản sử dụng&lt;/a&gt; của Yuumi Shop.</w:t>
       </w:r>
     </w:p>
     <w:p>
@@ -4703,289 +5065,6 @@
     </w:p>
     <w:p>
       <w:r>
-        <w:t xml:space="preserve">            </w:t>
-      </w:r>
-    </w:p>
-    <w:p>
-      <w:r>
-        <w:t>            &lt;input type="hidden" name="total_amount" id="totalInput" value="&lt;?= $total ?&gt;"&gt;</w:t>
-      </w:r>
-    </w:p>
-    <w:p>
-      <w:r>
-        <w:t>            &lt;input type="hidden" name="points_used" id="pointsInput" value="0"&gt;</w:t>
-      </w:r>
-    </w:p>
-    <w:p>
-      <w:r>
-        <w:t xml:space="preserve">            </w:t>
-      </w:r>
-    </w:p>
-    <w:p>
-      <w:r>
-        <w:t>            &lt;button type="submit" class="btn-confirm"&gt;ĐẶT HÀNG NGAY&lt;/button&gt;</w:t>
-      </w:r>
-    </w:p>
-    <w:p/>
-    <w:p>
-      <w:r>
-        <w:t>            &lt;script&gt;</w:t>
-      </w:r>
-    </w:p>
-    <w:p>
-      <w:r>
-        <w:t xml:space="preserve">                </w:t>
-      </w:r>
-      <w:r>
-        <w:rPr>
-          <w:i/>
-          <w:iCs/>
-        </w:rPr>
-        <w:t>const</w:t>
-      </w:r>
-      <w:r>
-        <w:t xml:space="preserve"> originalTotal = &lt;?= $total ?&gt;;</w:t>
-      </w:r>
-    </w:p>
-    <w:p>
-      <w:r>
-        <w:t xml:space="preserve">                </w:t>
-      </w:r>
-      <w:r>
-        <w:rPr>
-          <w:i/>
-          <w:iCs/>
-        </w:rPr>
-        <w:t>const</w:t>
-      </w:r>
-      <w:r>
-        <w:t xml:space="preserve"> userPoints = &lt;?= $user['points'] ?&gt;;</w:t>
-      </w:r>
-    </w:p>
-    <w:p>
-      <w:r>
-        <w:t xml:space="preserve">                </w:t>
-      </w:r>
-      <w:r>
-        <w:rPr>
-          <w:i/>
-          <w:iCs/>
-        </w:rPr>
-        <w:t>const</w:t>
-      </w:r>
-      <w:r>
-        <w:t xml:space="preserve"> pointValue = 1000; // 1 điểm = 1000đ</w:t>
-      </w:r>
-    </w:p>
-    <w:p/>
-    <w:p>
-      <w:r>
-        <w:t xml:space="preserve">                </w:t>
-      </w:r>
-      <w:r>
-        <w:rPr>
-          <w:i/>
-          <w:iCs/>
-        </w:rPr>
-        <w:t>function</w:t>
-      </w:r>
-      <w:r>
-        <w:t xml:space="preserve"> updateTotal() {</w:t>
-      </w:r>
-    </w:p>
-    <w:p>
-      <w:r>
-        <w:t xml:space="preserve">                    </w:t>
-      </w:r>
-      <w:r>
-        <w:rPr>
-          <w:i/>
-          <w:iCs/>
-        </w:rPr>
-        <w:t>const</w:t>
-      </w:r>
-      <w:r>
-        <w:t xml:space="preserve"> checkbox = document.getElementById('usePoints');</w:t>
-      </w:r>
-    </w:p>
-    <w:p>
-      <w:r>
-        <w:t xml:space="preserve">                    </w:t>
-      </w:r>
-      <w:r>
-        <w:rPr>
-          <w:i/>
-          <w:iCs/>
-        </w:rPr>
-        <w:t>const</w:t>
-      </w:r>
-      <w:r>
-        <w:t xml:space="preserve"> totalDisplay = document.getElementById('totalDisplay');</w:t>
-      </w:r>
-    </w:p>
-    <w:p>
-      <w:r>
-        <w:t xml:space="preserve">                    </w:t>
-      </w:r>
-      <w:r>
-        <w:rPr>
-          <w:i/>
-          <w:iCs/>
-        </w:rPr>
-        <w:t>const</w:t>
-      </w:r>
-      <w:r>
-        <w:t xml:space="preserve"> totalInput = document.getElementById('totalInput');</w:t>
-      </w:r>
-    </w:p>
-    <w:p>
-      <w:r>
-        <w:t xml:space="preserve">                    </w:t>
-      </w:r>
-      <w:r>
-        <w:rPr>
-          <w:i/>
-          <w:iCs/>
-        </w:rPr>
-        <w:t>const</w:t>
-      </w:r>
-      <w:r>
-        <w:t xml:space="preserve"> pointsInput = document.getElementById('pointsInput');</w:t>
-      </w:r>
-    </w:p>
-    <w:p/>
-    <w:p>
-      <w:r>
-        <w:t>                    if (checkbox &amp;&amp; checkbox.checked) {</w:t>
-      </w:r>
-    </w:p>
-    <w:p>
-      <w:r>
-        <w:t xml:space="preserve">                        </w:t>
-      </w:r>
-      <w:r>
-        <w:rPr>
-          <w:i/>
-          <w:iCs/>
-        </w:rPr>
-        <w:t>const</w:t>
-      </w:r>
-      <w:r>
-        <w:t xml:space="preserve"> discount = userPoints * pointValue;</w:t>
-      </w:r>
-    </w:p>
-    <w:p>
-      <w:r>
-        <w:t xml:space="preserve">                        </w:t>
-      </w:r>
-      <w:r>
-        <w:rPr>
-          <w:i/>
-          <w:iCs/>
-        </w:rPr>
-        <w:t>const</w:t>
-      </w:r>
-      <w:r>
-        <w:t xml:space="preserve"> newTotal = originalTotal - discount;</w:t>
-      </w:r>
-    </w:p>
-    <w:p>
-      <w:r>
-        <w:t>                        // Không cho âm tiền</w:t>
-      </w:r>
-    </w:p>
-    <w:p>
-      <w:r>
-        <w:t xml:space="preserve">                        </w:t>
-      </w:r>
-      <w:r>
-        <w:rPr>
-          <w:i/>
-          <w:iCs/>
-        </w:rPr>
-        <w:t>const</w:t>
-      </w:r>
-      <w:r>
-        <w:t xml:space="preserve"> finalTotal = newTotal &gt; 0 ? newTotal : 0;</w:t>
-      </w:r>
-    </w:p>
-    <w:p>
-      <w:r>
-        <w:t xml:space="preserve">                        </w:t>
-      </w:r>
-    </w:p>
-    <w:p>
-      <w:r>
-        <w:t>                        totalDisplay.innerHTML = new Intl.NumberFormat('vi-VN').format(finalTotal) + ' VND';</w:t>
-      </w:r>
-    </w:p>
-    <w:p>
-      <w:r>
-        <w:t>                        totalInput.value = finalTotal;</w:t>
-      </w:r>
-    </w:p>
-    <w:p>
-      <w:r>
-        <w:t>                        pointsInput.value = userPoints;</w:t>
-      </w:r>
-    </w:p>
-    <w:p>
-      <w:r>
-        <w:t>                    } else {</w:t>
-      </w:r>
-    </w:p>
-    <w:p>
-      <w:r>
-        <w:t>                        totalDisplay.innerHTML = new Intl.NumberFormat('vi-VN').format(originalTotal) + ' VND';</w:t>
-      </w:r>
-    </w:p>
-    <w:p>
-      <w:r>
-        <w:t>                        totalInput.value = originalTotal;</w:t>
-      </w:r>
-    </w:p>
-    <w:p>
-      <w:r>
-        <w:t>                        pointsInput.value = 0;</w:t>
-      </w:r>
-    </w:p>
-    <w:p>
-      <w:r>
-        <w:t>                    }</w:t>
-      </w:r>
-    </w:p>
-    <w:p>
-      <w:r>
-        <w:t>                }</w:t>
-      </w:r>
-    </w:p>
-    <w:p>
-      <w:r>
-        <w:t>            &lt;/script&gt;</w:t>
-      </w:r>
-    </w:p>
-    <w:p>
-      <w:r>
-        <w:t xml:space="preserve">            </w:t>
-      </w:r>
-    </w:p>
-    <w:p>
-      <w:r>
-        <w:t>            &lt;div style="margin-top: 15px; text-align: center; font-size: 12px; color: #888;"&gt;</w:t>
-      </w:r>
-    </w:p>
-    <w:p>
-      <w:r>
-        <w:t>                Bằng việc đặt hàng, bạn đồng ý với &lt;a href="#" style="color: #2ecc71;"&gt;Điều khoản sử dụng&lt;/a&gt; của Yuumi Shop.</w:t>
-      </w:r>
-    </w:p>
-    <w:p>
-      <w:r>
-        <w:t>            &lt;/div&gt;</w:t>
-      </w:r>
-    </w:p>
-    <w:p>
-      <w:r>
         <w:t>        &lt;/div&gt;</w:t>
       </w:r>
     </w:p>
@@ -5011,6 +5090,7 @@
         <w:t>&lt;/html&gt;</w:t>
       </w:r>
     </w:p>
+    <w:p/>
     <w:p/>
     <w:p>
       <w:pPr>
@@ -5910,9 +5990,25 @@
     </w:p>
     <w:p>
       <w:r>
-        <w:t>$total = $info['total_amount'];</w:t>
-      </w:r>
-    </w:p>
+        <w:t>$total_cart_value = 0; // Tính lại tổng giá trị giỏ hàng gốc để validate</w:t>
+      </w:r>
+    </w:p>
+    <w:p>
+      <w:r>
+        <w:t>foreach ($_SESSION['cart'] as $item) {</w:t>
+      </w:r>
+    </w:p>
+    <w:p>
+      <w:r>
+        <w:t>    $total_cart_value += $item['price'] * $item['qty'];</w:t>
+      </w:r>
+    </w:p>
+    <w:p>
+      <w:r>
+        <w:t>}</w:t>
+      </w:r>
+    </w:p>
+    <w:p/>
     <w:p>
       <w:r>
         <w:t>$payment_method = $info['payment_method'];</w:t>
@@ -5926,7 +6022,7 @@
     <w:p/>
     <w:p>
       <w:r>
-        <w:t>// Logic dùng điểm (nếu có)</w:t>
+        <w:t>// --- LOGIC XỬ LÝ ĐIỂM (SERVER SIDE VALIDATION) ---</w:t>
       </w:r>
     </w:p>
     <w:p>
@@ -5934,14 +6030,94 @@
         <w:t>$points_used = isset($info['points_used']) ? intval($info['points_used']) : 0;</w:t>
       </w:r>
     </w:p>
-    <w:p>
-      <w:r>
-        <w:t>$discount_amount = $points_used * 1000; // 1 điểm = 1000đ</w:t>
-      </w:r>
-    </w:p>
-    <w:p>
-      <w:r>
-        <w:t>$final_total = $total - $discount_amount;</w:t>
+    <w:p/>
+    <w:p>
+      <w:r>
+        <w:t>// Validate 1: Khách có đủ điểm không?</w:t>
+      </w:r>
+    </w:p>
+    <w:p>
+      <w:r>
+        <w:t>$stmtUser = $conn-&gt;prepare("SELECT points FROM users WHERE id = ?");</w:t>
+      </w:r>
+    </w:p>
+    <w:p>
+      <w:r>
+        <w:t>$stmtUser-&gt;execute([$user_id]);</w:t>
+      </w:r>
+    </w:p>
+    <w:p>
+      <w:r>
+        <w:t>$userPoints = $stmtUser-&gt;fetchColumn();</w:t>
+      </w:r>
+    </w:p>
+    <w:p/>
+    <w:p>
+      <w:r>
+        <w:t>if ($points_used &gt; $userPoints) {</w:t>
+      </w:r>
+    </w:p>
+    <w:p>
+      <w:r>
+        <w:t>    die("Lỗi: Số điểm sử dụng vượt quá số điểm hiện có!");</w:t>
+      </w:r>
+    </w:p>
+    <w:p>
+      <w:r>
+        <w:t>}</w:t>
+      </w:r>
+    </w:p>
+    <w:p/>
+    <w:p>
+      <w:r>
+        <w:t>// Validate 2: Kiểm tra giới hạn 20% (Safe Mode)</w:t>
+      </w:r>
+    </w:p>
+    <w:p>
+      <w:r>
+        <w:t xml:space="preserve">$max_allowed_points = floor(($total_cart_value * 0.2) / 100); </w:t>
+      </w:r>
+    </w:p>
+    <w:p>
+      <w:r>
+        <w:t>if ($points_used &gt; $max_allowed_points) {</w:t>
+      </w:r>
+    </w:p>
+    <w:p>
+      <w:r>
+        <w:t>    // Nếu hack HTML để gửi số điểm cao hơn quy định -&gt; Reset về max cho phép</w:t>
+      </w:r>
+    </w:p>
+    <w:p>
+      <w:r>
+        <w:t xml:space="preserve">    $points_used = $max_allowed_points; </w:t>
+      </w:r>
+    </w:p>
+    <w:p>
+      <w:r>
+        <w:t>}</w:t>
+      </w:r>
+    </w:p>
+    <w:p/>
+    <w:p>
+      <w:r>
+        <w:t>$discount_amount = $points_used * 100; // 1 điểm = 100đ</w:t>
+      </w:r>
+    </w:p>
+    <w:p>
+      <w:r>
+        <w:t>$final_total = $total_cart_value - $discount_amount;</w:t>
+      </w:r>
+    </w:p>
+    <w:p/>
+    <w:p>
+      <w:r>
+        <w:t>// Đảm bảo không âm</w:t>
+      </w:r>
+    </w:p>
+    <w:p>
+      <w:r>
+        <w:t>if ($final_total &lt; 0) $final_total = 0;</w:t>
       </w:r>
     </w:p>
     <w:p/>
@@ -5992,7 +6168,6 @@
         <w:t>    $stmt_item = $conn-&gt;prepare($sql_item);</w:t>
       </w:r>
     </w:p>
-    <w:p/>
     <w:p>
       <w:r>
         <w:t>    foreach ($_SESSION['cart'] as $pid =&gt; $item) {</w:t>
@@ -6011,17 +6186,7 @@
     <w:p/>
     <w:p>
       <w:r>
-        <w:t>    // 3. XỬ LÝ ĐIỂM THƯỞNG</w:t>
-      </w:r>
-    </w:p>
-    <w:p>
-      <w:r>
-        <w:t xml:space="preserve">    </w:t>
-      </w:r>
-    </w:p>
-    <w:p>
-      <w:r>
-        <w:t>    // Trừ điểm đã dùng (nếu có)</w:t>
+        <w:t>    // 3. TRỪ ĐIỂM ĐÃ DÙNG (Không cộng điểm ở đây nữa!)</w:t>
       </w:r>
     </w:p>
     <w:p>
@@ -6047,37 +6212,12 @@
     <w:p/>
     <w:p>
       <w:r>
-        <w:t>    // Cộng điểm mới (Chỉ cộng khi thanh toán VNPAY hoặc Admin xác nhận Paid)</w:t>
-      </w:r>
-    </w:p>
-    <w:p>
-      <w:r>
-        <w:t>    // Tỷ lệ: 100,000 VND = 10 điểm</w:t>
-      </w:r>
-    </w:p>
-    <w:p>
-      <w:r>
-        <w:t>    if ($status == 'paid') {</w:t>
-      </w:r>
-    </w:p>
-    <w:p>
-      <w:r>
-        <w:t>        $points_earned = floor($final_total / 100000);</w:t>
-      </w:r>
-    </w:p>
-    <w:p>
-      <w:r>
-        <w:t>        $stmt_add = $conn-&gt;prepare("UPDATE users SET points = points + ? WHERE id = ?");</w:t>
-      </w:r>
-    </w:p>
-    <w:p>
-      <w:r>
-        <w:t>        $stmt_add-&gt;execute([$points_earned, $user_id]);</w:t>
-      </w:r>
-    </w:p>
-    <w:p>
-      <w:r>
-        <w:t>    }</w:t>
+        <w:t>    // *** LƯU Ý: Đã xóa đoạn cộng điểm ở đây theo yêu cầu Safe Mode ***</w:t>
+      </w:r>
+    </w:p>
+    <w:p>
+      <w:r>
+        <w:t>    // Điểm sẽ được cộng ở admin/orders.php khi đơn hàng chuyển sang 'shipped'</w:t>
       </w:r>
     </w:p>
     <w:p/>
@@ -6091,13 +6231,16 @@
         <w:t>    $conn-&gt;prepare("DELETE FROM cart WHERE user_id = ?")-&gt;execute([$user_id]);</w:t>
       </w:r>
     </w:p>
-    <w:p/>
+    <w:p>
+      <w:r>
+        <w:t xml:space="preserve">    </w:t>
+      </w:r>
+    </w:p>
     <w:p>
       <w:r>
         <w:t>    $conn-&gt;commit();</w:t>
       </w:r>
     </w:p>
-    <w:p/>
     <w:p>
       <w:r>
         <w:t>    unset($_SESSION['cart']);</w:t>
@@ -6108,11 +6251,7 @@
         <w:t>    unset($_SESSION['temp_order']);</w:t>
       </w:r>
     </w:p>
-    <w:p>
-      <w:r>
-        <w:t xml:space="preserve">    </w:t>
-      </w:r>
-    </w:p>
+    <w:p/>
     <w:p>
       <w:r>
         <w:t>    $_SESSION['flash_msg'] = ['msg' =&gt; 'Thanh toán thành công!', 'type' =&gt; 'success'];</w:t>
@@ -13137,7 +13276,7 @@
     </w:p>
     <w:p>
       <w:r>
-        <w:t xml:space="preserve">                                &lt;a href="cart.php?remove=&lt;?= $id ?&gt;" </w:t>
+        <w:t xml:space="preserve">                                &lt;a style="color: red" href="cart.php?remove=&lt;?= $id ?&gt;" </w:t>
       </w:r>
     </w:p>
     <w:p>
@@ -16393,23 +16532,12 @@
       </w:r>
     </w:p>
     <w:p>
-      <w:pPr>
-        <w:rPr>
-          <w:lang w:val="nl-NL"/>
-        </w:rPr>
-      </w:pPr>
-      <w:r>
-        <w:rPr>
-          <w:lang w:val="nl-NL"/>
-        </w:rPr>
+      <w:r>
         <w:t>                    &lt;label&gt;Tên sản phẩm:&lt;/label&gt;</w:t>
       </w:r>
     </w:p>
     <w:p>
       <w:r>
-        <w:rPr>
-          <w:lang w:val="nl-NL"/>
-        </w:rPr>
         <w:t xml:space="preserve">                    </w:t>
       </w:r>
       <w:r>
@@ -16856,18 +16984,18 @@
     </w:p>
     <w:p>
       <w:r>
-        <w:t>    $status = $_POST['status'];</w:t>
-      </w:r>
-    </w:p>
-    <w:p/>
-    <w:p>
-      <w:r>
-        <w:t>    // Lấy trạng thái cũ để tránh cộng điểm nhiều lần</w:t>
-      </w:r>
-    </w:p>
-    <w:p>
-      <w:r>
-        <w:t>    $old_order = $conn-&gt;query("SELECT status, user_id, total_amount FROM orders WHERE id=$order_id")-&gt;fetch();</w:t>
+        <w:t>    $new_status = $_POST['status'];</w:t>
+      </w:r>
+    </w:p>
+    <w:p/>
+    <w:p>
+      <w:r>
+        <w:t>    // Lấy thông tin đơn hàng cũ để check</w:t>
+      </w:r>
+    </w:p>
+    <w:p>
+      <w:r>
+        <w:t>    $old_order = $conn-&gt;query("SELECT status, user_id FROM orders WHERE id=$order_id")-&gt;fetch();</w:t>
       </w:r>
     </w:p>
     <w:p/>
@@ -16878,32 +17006,184 @@
     </w:p>
     <w:p>
       <w:r>
-        <w:t>    if ($stmt-&gt;execute([$status, $order_id])) {</w:t>
-      </w:r>
-    </w:p>
-    <w:p>
-      <w:r>
-        <w:t>        // Nếu chuyển sang PAID và trước đó chưa PAID -&gt; Cộng điểm</w:t>
-      </w:r>
-    </w:p>
-    <w:p>
-      <w:r>
-        <w:t>        if ($status == 'paid' &amp;&amp; $old_order['status'] != 'paid') {</w:t>
-      </w:r>
-    </w:p>
-    <w:p>
-      <w:r>
-        <w:t>            $points = floor($old_order['total_amount'] / 100000); // 10k = 1 điểm</w:t>
-      </w:r>
-    </w:p>
-    <w:p>
-      <w:r>
-        <w:t>            $conn-&gt;prepare("UPDATE users SET points = points + ? WHERE id = ?")</w:t>
-      </w:r>
-    </w:p>
-    <w:p>
-      <w:r>
-        <w:t>                 -&gt;execute([$points, $old_order['user_id']]);</w:t>
+        <w:t>    if ($stmt-&gt;execute([$new_status, $order_id])) {</w:t>
+      </w:r>
+    </w:p>
+    <w:p>
+      <w:r>
+        <w:t xml:space="preserve">        </w:t>
+      </w:r>
+    </w:p>
+    <w:p>
+      <w:r>
+        <w:t>        // --- LOGIC TÍCH ĐIỂM SAFE MODE ---</w:t>
+      </w:r>
+    </w:p>
+    <w:p>
+      <w:r>
+        <w:t>        // Chỉ cộng điểm khi chuyển sang 'shipped' VÀ trạng thái cũ chưa phải là 'shipped' hoặc 'completed'</w:t>
+      </w:r>
+    </w:p>
+    <w:p>
+      <w:r>
+        <w:t>        // (Để tránh cộng điểm nhiều lần nếu admin bấm update liên tục)</w:t>
+      </w:r>
+    </w:p>
+    <w:p>
+      <w:r>
+        <w:t>        if ($new_status == 'shipped' &amp;&amp; !in_array($old_order['status'], ['shipped', 'completed'])) {</w:t>
+      </w:r>
+    </w:p>
+    <w:p>
+      <w:r>
+        <w:t xml:space="preserve">            </w:t>
+      </w:r>
+    </w:p>
+    <w:p>
+      <w:r>
+        <w:t>            // 1. Lấy chi tiết các món trong đơn hàng để phân loại</w:t>
+      </w:r>
+    </w:p>
+    <w:p>
+      <w:r>
+        <w:t xml:space="preserve">            $sql_items = "SELECT oi.quantity, oi.price, p.category </w:t>
+      </w:r>
+    </w:p>
+    <w:p>
+      <w:r>
+        <w:t xml:space="preserve">                          FROM order_items oi </w:t>
+      </w:r>
+    </w:p>
+    <w:p>
+      <w:r>
+        <w:t xml:space="preserve">                          JOIN products p ON oi.product_id = p.id </w:t>
+      </w:r>
+    </w:p>
+    <w:p>
+      <w:r>
+        <w:t>                          WHERE oi.order_id = ?";</w:t>
+      </w:r>
+    </w:p>
+    <w:p>
+      <w:r>
+        <w:t>            $items = $conn-&gt;prepare($sql_items);</w:t>
+      </w:r>
+    </w:p>
+    <w:p>
+      <w:r>
+        <w:t>            $items-&gt;execute([$order_id]);</w:t>
+      </w:r>
+    </w:p>
+    <w:p>
+      <w:r>
+        <w:t xml:space="preserve">            </w:t>
+      </w:r>
+    </w:p>
+    <w:p>
+      <w:r>
+        <w:t>            $total_points_earned = 0;</w:t>
+      </w:r>
+    </w:p>
+    <w:p/>
+    <w:p>
+      <w:r>
+        <w:t>            while ($item = $items-&gt;fetch(</w:t>
+      </w:r>
+      <w:r>
+        <w:rPr>
+          <w:i/>
+          <w:iCs/>
+        </w:rPr>
+        <w:t>PDO</w:t>
+      </w:r>
+      <w:r>
+        <w:t>::FETCH_ASSOC)) {</w:t>
+      </w:r>
+    </w:p>
+    <w:p>
+      <w:r>
+        <w:t>                $item_total = $item['price'] * $item['quantity'];</w:t>
+      </w:r>
+    </w:p>
+    <w:p>
+      <w:r>
+        <w:t xml:space="preserve">                </w:t>
+      </w:r>
+    </w:p>
+    <w:p>
+      <w:r>
+        <w:t>                // 2. Tính điểm theo từng món</w:t>
+      </w:r>
+    </w:p>
+    <w:p>
+      <w:r>
+        <w:t>                if ($item['category'] == 'pet') {</w:t>
+      </w:r>
+    </w:p>
+    <w:p>
+      <w:r>
+        <w:t>                    // Thú cưng: 1 triệu = 1 điểm (Lợi nhuận thấp)</w:t>
+      </w:r>
+    </w:p>
+    <w:p>
+      <w:r>
+        <w:t>                    $points = floor($item_total / 1000000);</w:t>
+      </w:r>
+    </w:p>
+    <w:p>
+      <w:r>
+        <w:t>                } else {</w:t>
+      </w:r>
+    </w:p>
+    <w:p>
+      <w:r>
+        <w:t>                    // Phụ kiện, thức ăn, v.v...: 100k = 1 điểm (Lợi nhuận cao)</w:t>
+      </w:r>
+    </w:p>
+    <w:p>
+      <w:r>
+        <w:t>                    $points = floor($item_total / 100000);</w:t>
+      </w:r>
+    </w:p>
+    <w:p>
+      <w:r>
+        <w:t>                }</w:t>
+      </w:r>
+    </w:p>
+    <w:p>
+      <w:r>
+        <w:t>                $total_points_earned += $points;</w:t>
+      </w:r>
+    </w:p>
+    <w:p>
+      <w:r>
+        <w:t>            }</w:t>
+      </w:r>
+    </w:p>
+    <w:p/>
+    <w:p>
+      <w:r>
+        <w:t>            // 3. Cộng điểm cho user</w:t>
+      </w:r>
+    </w:p>
+    <w:p>
+      <w:r>
+        <w:t>            if ($total_points_earned &gt; 0) {</w:t>
+      </w:r>
+    </w:p>
+    <w:p>
+      <w:r>
+        <w:t>                $conn-&gt;prepare("UPDATE users SET points = points + ? WHERE id = ?")</w:t>
+      </w:r>
+    </w:p>
+    <w:p>
+      <w:r>
+        <w:t>                     -&gt;execute([$total_points_earned, $old_order['user_id']]);</w:t>
+      </w:r>
+    </w:p>
+    <w:p>
+      <w:r>
+        <w:t>            }</w:t>
       </w:r>
     </w:p>
     <w:p>
@@ -16911,14 +17191,10 @@
         <w:t>        }</w:t>
       </w:r>
     </w:p>
-    <w:p>
-      <w:r>
-        <w:t>        // THAY THẾ ALERT BẰNG FLASH MESSAGE</w:t>
-      </w:r>
-    </w:p>
-    <w:p>
-      <w:r>
-        <w:t>        $_SESSION['flash_msg'] = ['msg' =&gt; 'Cập nhật trạng thái đơn hàng thành công!', 'type' =&gt; 'success'];</w:t>
+    <w:p/>
+    <w:p>
+      <w:r>
+        <w:t>        $_SESSION['flash_msg'] = ['msg' =&gt; 'Cập nhật trạng thái thành công!', 'type' =&gt; 'success'];</w:t>
       </w:r>
     </w:p>
     <w:p>
@@ -16928,7 +17204,7 @@
     </w:p>
     <w:p>
       <w:r>
-        <w:t>        $_SESSION['flash_msg'] = ['msg' =&gt; 'Lỗi khi cập nhật trạng thái!', 'type' =&gt; 'error'];</w:t>
+        <w:t>        $_SESSION['flash_msg'] = ['msg' =&gt; 'Lỗi cập nhật!', 'type' =&gt; 'error'];</w:t>
       </w:r>
     </w:p>
     <w:p>
@@ -16939,11 +17215,6 @@
     <w:p>
       <w:r>
         <w:t xml:space="preserve">    </w:t>
-      </w:r>
-    </w:p>
-    <w:p>
-      <w:r>
-        <w:t>    // Redirect để kích hoạt Toast và tránh resubmit form</w:t>
       </w:r>
     </w:p>
     <w:p>

</xml_diff>

<commit_message>
update lại cổng 3306 để truy cập mysql
</commit_message>
<xml_diff>
--- a/Yuumishop.docx
+++ b/Yuumishop.docx
@@ -1087,9 +1087,12 @@
       </w:r>
       <w:r>
         <w:br/>
+      </w:r>
+      <w:r>
         <w:t>version: '3.8'</w:t>
       </w:r>
     </w:p>
+    <w:p/>
     <w:p>
       <w:r>
         <w:t>services:</w:t>
@@ -1097,112 +1100,123 @@
     </w:p>
     <w:p>
       <w:r>
-        <w:t xml:space="preserve">  web:</w:t>
-      </w:r>
-    </w:p>
-    <w:p>
-      <w:r>
-        <w:t xml:space="preserve">    build: .</w:t>
-      </w:r>
-    </w:p>
-    <w:p>
-      <w:r>
-        <w:t xml:space="preserve">    ports:</w:t>
-      </w:r>
-    </w:p>
-    <w:p>
-      <w:r>
-        <w:t xml:space="preserve">      - "8080:80"  # Chạy web ở cổng 8080 để tránh đụng port máy ní</w:t>
-      </w:r>
-    </w:p>
-    <w:p>
-      <w:r>
-        <w:t xml:space="preserve">    volumes:</w:t>
-      </w:r>
-    </w:p>
-    <w:p>
-      <w:r>
-        <w:t xml:space="preserve">      - ./src:/var/www/html</w:t>
-      </w:r>
-    </w:p>
-    <w:p>
-      <w:r>
-        <w:t xml:space="preserve">    depends_on:</w:t>
-      </w:r>
-    </w:p>
-    <w:p>
-      <w:r>
-        <w:t xml:space="preserve">      - db</w:t>
-      </w:r>
-    </w:p>
-    <w:p>
-      <w:r>
-        <w:t xml:space="preserve">    networks:</w:t>
-      </w:r>
-    </w:p>
-    <w:p>
-      <w:r>
-        <w:t xml:space="preserve">      - yuumi-network</w:t>
-      </w:r>
-    </w:p>
-    <w:p>
-      <w:r>
-        <w:t xml:space="preserve">  db:</w:t>
-      </w:r>
-    </w:p>
-    <w:p>
-      <w:r>
-        <w:t xml:space="preserve">    image: mysql:5.7</w:t>
-      </w:r>
-    </w:p>
-    <w:p>
-      <w:r>
-        <w:t xml:space="preserve">    environment:</w:t>
-      </w:r>
-    </w:p>
-    <w:p>
-      <w:r>
-        <w:t xml:space="preserve">      MYSQL_ROOT_PASSWORD: root</w:t>
-      </w:r>
-    </w:p>
-    <w:p>
-      <w:r>
-        <w:t xml:space="preserve">      MYSQL_DATABASE: yuumishop</w:t>
-      </w:r>
-    </w:p>
-    <w:p>
-      <w:r>
-        <w:t xml:space="preserve">      MYSQL_USER: user</w:t>
-      </w:r>
-    </w:p>
-    <w:p>
-      <w:r>
-        <w:t xml:space="preserve">      MYSQL_PASSWORD: password</w:t>
-      </w:r>
-    </w:p>
-    <w:p>
-      <w:r>
-        <w:t xml:space="preserve">    volumes:</w:t>
-      </w:r>
-    </w:p>
-    <w:p>
-      <w:r>
-        <w:t xml:space="preserve">      - db_data:/var/lib/mysql</w:t>
-      </w:r>
-    </w:p>
-    <w:p>
-      <w:r>
-        <w:t xml:space="preserve">      - ./init.sql:/docker-entrypoint-initdb.d/init.sql # Tự động chạy file SQL fix ảnh</w:t>
-      </w:r>
-    </w:p>
-    <w:p>
-      <w:r>
-        <w:t xml:space="preserve">    networks:</w:t>
-      </w:r>
-    </w:p>
-    <w:p>
-      <w:r>
-        <w:t xml:space="preserve">      - yuumi-network</w:t>
+        <w:t>  web:</w:t>
+      </w:r>
+    </w:p>
+    <w:p>
+      <w:r>
+        <w:t>    build: .</w:t>
+      </w:r>
+    </w:p>
+    <w:p>
+      <w:r>
+        <w:t>    ports:</w:t>
+      </w:r>
+    </w:p>
+    <w:p>
+      <w:r>
+        <w:t>      - "8080:80"  # Chạy web ở cổng 8080 để tránh đụng port máy ní</w:t>
+      </w:r>
+    </w:p>
+    <w:p>
+      <w:r>
+        <w:t>    volumes:</w:t>
+      </w:r>
+    </w:p>
+    <w:p>
+      <w:r>
+        <w:t>      - ./src:/var/www/html</w:t>
+      </w:r>
+    </w:p>
+    <w:p>
+      <w:r>
+        <w:t>    depends_on:</w:t>
+      </w:r>
+    </w:p>
+    <w:p>
+      <w:r>
+        <w:t>      - db</w:t>
+      </w:r>
+    </w:p>
+    <w:p>
+      <w:r>
+        <w:t>    networks:</w:t>
+      </w:r>
+    </w:p>
+    <w:p>
+      <w:r>
+        <w:t>      - yuumi-network</w:t>
+      </w:r>
+    </w:p>
+    <w:p/>
+    <w:p>
+      <w:r>
+        <w:t>  db:</w:t>
+      </w:r>
+    </w:p>
+    <w:p>
+      <w:r>
+        <w:t>      image: mysql:5.7</w:t>
+      </w:r>
+    </w:p>
+    <w:p>
+      <w:r>
+        <w:t>      environment:</w:t>
+      </w:r>
+    </w:p>
+    <w:p>
+      <w:r>
+        <w:t>        MYSQL_ROOT_PASSWORD: root</w:t>
+      </w:r>
+    </w:p>
+    <w:p>
+      <w:r>
+        <w:t>        MYSQL_DATABASE: yuumishop</w:t>
+      </w:r>
+    </w:p>
+    <w:p>
+      <w:r>
+        <w:t>        MYSQL_USER: user</w:t>
+      </w:r>
+    </w:p>
+    <w:p>
+      <w:r>
+        <w:t>        MYSQL_PASSWORD: password</w:t>
+      </w:r>
+    </w:p>
+    <w:p>
+      <w:r>
+        <w:t xml:space="preserve">      ports:                 </w:t>
+      </w:r>
+    </w:p>
+    <w:p>
+      <w:r>
+        <w:t xml:space="preserve">        - "3306:3306"       </w:t>
+      </w:r>
+    </w:p>
+    <w:p>
+      <w:r>
+        <w:t>      volumes:</w:t>
+      </w:r>
+    </w:p>
+    <w:p>
+      <w:r>
+        <w:t>        - db_data:/var/lib/mysql</w:t>
+      </w:r>
+    </w:p>
+    <w:p>
+      <w:r>
+        <w:t>        - ./init.sql:/docker-entrypoint-initdb.d/init.sql</w:t>
+      </w:r>
+    </w:p>
+    <w:p>
+      <w:r>
+        <w:t>      networks:</w:t>
+      </w:r>
+    </w:p>
+    <w:p>
+      <w:r>
+        <w:t>        - yuumi-network</w:t>
       </w:r>
     </w:p>
     <w:p/>
@@ -1213,7 +1227,7 @@
     </w:p>
     <w:p>
       <w:r>
-        <w:t xml:space="preserve">  yuumi-network:</w:t>
+        <w:t>  yuumi-network:</w:t>
       </w:r>
     </w:p>
     <w:p/>
@@ -1224,7 +1238,7 @@
     </w:p>
     <w:p>
       <w:r>
-        <w:t xml:space="preserve">  db_data:</w:t>
+        <w:t>  db_data:</w:t>
       </w:r>
     </w:p>
     <w:p/>
@@ -4034,15 +4048,14 @@
     </w:p>
     <w:p>
       <w:r>
-        <w:t xml:space="preserve">&lt;?php </w:t>
-      </w:r>
-    </w:p>
-    <w:p>
-      <w:r>
-        <w:t xml:space="preserve">require_once 'includes/db.php'; </w:t>
-      </w:r>
-    </w:p>
-    <w:p/>
+        <w:t>&lt;?php</w:t>
+      </w:r>
+    </w:p>
+    <w:p>
+      <w:r>
+        <w:t>require_once 'includes/db.php';</w:t>
+      </w:r>
+    </w:p>
     <w:p>
       <w:r>
         <w:t>// Kiểm tra Login &amp; Cart</w:t>
@@ -4133,28 +4146,12 @@
     </w:p>
     <w:p>
       <w:r>
-        <w:t>// 1 điểm = 100đ.</w:t>
-      </w:r>
-    </w:p>
-    <w:p>
-      <w:r>
-        <w:t>// Tối đa giảm 20% giá trị đơn hàng.</w:t>
-      </w:r>
-    </w:p>
-    <w:p>
-      <w:r>
         <w:t>$max_discount_vnd = $total * 0.20; // 20% tổng đơn</w:t>
       </w:r>
     </w:p>
     <w:p>
       <w:r>
-        <w:t>$max_points_allowed = floor($max_discount_vnd / 100); // Đổi ra số điểm tối đa được dùng</w:t>
-      </w:r>
-    </w:p>
-    <w:p/>
-    <w:p>
-      <w:r>
-        <w:t>// Số điểm khách thực tế có thể dùng (Min của: điểm đang có VÀ giới hạn cho phép)</w:t>
+        <w:t xml:space="preserve">$max_points_allowed = floor($max_discount_vnd / 100); </w:t>
       </w:r>
     </w:p>
     <w:p>
@@ -4413,7 +4410,7 @@
     </w:p>
     <w:p>
       <w:r>
-        <w:t>                    &lt;input type="text" name="address" class="checkout-input" value="&lt;?= htmlspecialchars($user['address']) ?&gt;" placeholder="Số nhà, tên đường, phường/xã, quận/huyện..." required&gt;</w:t>
+        <w:t>                    &lt;input type="text" name="address" class="checkout-input" placeholder="Số nhà, tên đường, phường/xã, quận/huyện..." required&gt;</w:t>
       </w:r>
     </w:p>
     <w:p>
@@ -4438,7 +4435,7 @@
     </w:p>
     <w:p>
       <w:r>
-        <w:t>                    &lt;textarea name="note" class="checkout-input" rows="2" placeholder="Ví dụ: Giao giờ hành chính, gọi trước khi giao..."&gt;&lt;/textarea&gt;</w:t>
+        <w:t>                    &lt;textarea  style="resize: none" name="note" class="checkout-input" rows="2" placeholder="Ví dụ: Giao giờ hành chính, gọi trước khi giao..."&gt;&lt;/textarea&gt;</w:t>
       </w:r>
     </w:p>
     <w:p>
@@ -4484,7 +4481,7 @@
     </w:p>
     <w:p>
       <w:r>
-        <w:t>                        &lt;strong&gt;Thanh toán khi nhận hàng (COD)&lt;/strong&gt;</w:t>
+        <w:t>                        &lt;strong&gt;Thanh toán khi nhận hàng&lt;/strong&gt;</w:t>
       </w:r>
     </w:p>
     <w:p>
@@ -4559,7 +4556,7 @@
     </w:p>
     <w:p>
       <w:r>
-        <w:t>            &lt;a href="cart.php" style="display: inline-block; margin-top: 20px; color: #666; text-decoration: none;"&gt;&amp;larr; Quay lại giỏ hàng&lt;/a&gt;</w:t>
+        <w:t>            &lt;a href="cart.php" class="back-link"&gt;← Quay lại giỏ hàng&lt;/a&gt;</w:t>
       </w:r>
     </w:p>
     <w:p>
@@ -4808,12 +4805,92 @@
     <w:p/>
     <w:p>
       <w:r>
-        <w:t>            &lt;script&gt;</w:t>
-      </w:r>
-    </w:p>
-    <w:p>
-      <w:r>
-        <w:t xml:space="preserve">                </w:t>
+        <w:t>            &lt;div class="total-row"&gt;</w:t>
+      </w:r>
+    </w:p>
+    <w:p>
+      <w:r>
+        <w:t>                &lt;span&gt;Tổng cộng&lt;/span&gt;</w:t>
+      </w:r>
+    </w:p>
+    <w:p>
+      <w:r>
+        <w:t>                &lt;span class="total-price" id="totalDisplay"&gt;&lt;?= number_format($total) ?&gt; VND&lt;/span&gt;</w:t>
+      </w:r>
+    </w:p>
+    <w:p>
+      <w:r>
+        <w:t>            &lt;/div&gt;</w:t>
+      </w:r>
+    </w:p>
+    <w:p/>
+    <w:p>
+      <w:r>
+        <w:t>            &lt;input type="hidden" name="total_amount" id="totalInput" value="&lt;?= $total ?&gt;"&gt;</w:t>
+      </w:r>
+    </w:p>
+    <w:p>
+      <w:r>
+        <w:t>            &lt;input type="hidden" name="points_used" id="pointsInput" value="0"&gt;</w:t>
+      </w:r>
+    </w:p>
+    <w:p/>
+    <w:p>
+      <w:r>
+        <w:t>            &lt;button type="submit" class="btn-confirm"&gt;</w:t>
+      </w:r>
+    </w:p>
+    <w:p>
+      <w:r>
+        <w:t>                ĐẶT HÀNG NGAY</w:t>
+      </w:r>
+    </w:p>
+    <w:p>
+      <w:r>
+        <w:t>            &lt;/button&gt;</w:t>
+      </w:r>
+    </w:p>
+    <w:p/>
+    <w:p>
+      <w:r>
+        <w:t>            &lt;div style="margin-top: 15px; text-align: center; font-size: 15px; color: #888;"&gt;</w:t>
+      </w:r>
+    </w:p>
+    <w:p>
+      <w:r>
+        <w:t>                Bằng việc đặt hàng, bạn đồng ý với &lt;a href="#" style="color: #2ecc71;"&gt;Điều khoản sử dụng&lt;/a&gt; của Yuumi Shop.</w:t>
+      </w:r>
+    </w:p>
+    <w:p>
+      <w:r>
+        <w:t>            &lt;/div&gt;</w:t>
+      </w:r>
+    </w:p>
+    <w:p>
+      <w:r>
+        <w:t>        &lt;/div&gt;</w:t>
+      </w:r>
+    </w:p>
+    <w:p/>
+    <w:p>
+      <w:r>
+        <w:t>    &lt;/form&gt;</w:t>
+      </w:r>
+    </w:p>
+    <w:p>
+      <w:r>
+        <w:t>&lt;/div&gt;</w:t>
+      </w:r>
+    </w:p>
+    <w:p/>
+    <w:p>
+      <w:r>
+        <w:t>&lt;script&gt;</w:t>
+      </w:r>
+    </w:p>
+    <w:p>
+      <w:r>
+        <w:t xml:space="preserve">    </w:t>
       </w:r>
       <w:r>
         <w:rPr>
@@ -4828,12 +4905,7 @@
     </w:p>
     <w:p>
       <w:r>
-        <w:t>                // Lấy số điểm đã tính toán giới hạn từ PHP</w:t>
-      </w:r>
-    </w:p>
-    <w:p>
-      <w:r>
-        <w:t xml:space="preserve">                </w:t>
+        <w:t xml:space="preserve">    </w:t>
       </w:r>
       <w:r>
         <w:rPr>
@@ -4848,7 +4920,7 @@
     </w:p>
     <w:p>
       <w:r>
-        <w:t xml:space="preserve">                </w:t>
+        <w:t xml:space="preserve">    </w:t>
       </w:r>
       <w:r>
         <w:rPr>
@@ -4858,13 +4930,13 @@
         <w:t>const</w:t>
       </w:r>
       <w:r>
-        <w:t xml:space="preserve"> pointValue = 100; // 1 điểm = 100đ (Logic mới)</w:t>
-      </w:r>
-    </w:p>
-    <w:p/>
-    <w:p>
-      <w:r>
-        <w:t xml:space="preserve">                </w:t>
+        <w:t xml:space="preserve"> pointValue = 100; </w:t>
+      </w:r>
+    </w:p>
+    <w:p/>
+    <w:p>
+      <w:r>
+        <w:t xml:space="preserve">    </w:t>
       </w:r>
       <w:r>
         <w:rPr>
@@ -4879,7 +4951,7 @@
     </w:p>
     <w:p>
       <w:r>
-        <w:t xml:space="preserve">                    </w:t>
+        <w:t xml:space="preserve">        </w:t>
       </w:r>
       <w:r>
         <w:rPr>
@@ -4894,7 +4966,7 @@
     </w:p>
     <w:p>
       <w:r>
-        <w:t xml:space="preserve">                    </w:t>
+        <w:t xml:space="preserve">        </w:t>
       </w:r>
       <w:r>
         <w:rPr>
@@ -4909,7 +4981,7 @@
     </w:p>
     <w:p>
       <w:r>
-        <w:t xml:space="preserve">                    </w:t>
+        <w:t xml:space="preserve">        </w:t>
       </w:r>
       <w:r>
         <w:rPr>
@@ -4924,7 +4996,7 @@
     </w:p>
     <w:p>
       <w:r>
-        <w:t xml:space="preserve">                    </w:t>
+        <w:t xml:space="preserve">        </w:t>
       </w:r>
       <w:r>
         <w:rPr>
@@ -4940,12 +5012,12 @@
     <w:p/>
     <w:p>
       <w:r>
-        <w:t>                    if (checkbox &amp;&amp; checkbox.checked) {</w:t>
-      </w:r>
-    </w:p>
-    <w:p>
-      <w:r>
-        <w:t xml:space="preserve">                        </w:t>
+        <w:t>        if (checkbox &amp;&amp; checkbox.checked) {</w:t>
+      </w:r>
+    </w:p>
+    <w:p>
+      <w:r>
+        <w:t xml:space="preserve">            </w:t>
       </w:r>
       <w:r>
         <w:rPr>
@@ -4960,7 +5032,7 @@
     </w:p>
     <w:p>
       <w:r>
-        <w:t xml:space="preserve">                        </w:t>
+        <w:t xml:space="preserve">            </w:t>
       </w:r>
       <w:r>
         <w:rPr>
@@ -4975,108 +5047,194 @@
     </w:p>
     <w:p>
       <w:r>
-        <w:t xml:space="preserve">                        </w:t>
-      </w:r>
-    </w:p>
-    <w:p>
-      <w:r>
-        <w:t>                        // Format tiền Việt Nam</w:t>
-      </w:r>
-    </w:p>
-    <w:p>
-      <w:r>
-        <w:t>                        totalDisplay.innerHTML = new Intl.NumberFormat('vi-VN').format(newTotal) + ' VND';</w:t>
-      </w:r>
-    </w:p>
-    <w:p>
-      <w:r>
-        <w:t>                        totalDisplay.innerHTML += ` &lt;br&gt;&lt;small style='color:green; font-size:12px'&gt;(Đã giảm ${new Intl.NumberFormat('vi-VN').format(discount)}đ)&lt;/small&gt;`;</w:t>
-      </w:r>
-    </w:p>
-    <w:p>
-      <w:r>
-        <w:t xml:space="preserve">                        </w:t>
-      </w:r>
-    </w:p>
-    <w:p>
-      <w:r>
-        <w:t>                        totalInput.value = newTotal;</w:t>
-      </w:r>
-    </w:p>
-    <w:p>
-      <w:r>
-        <w:t>                        pointsInput.value = usablePoints; // Gửi số điểm thực dùng về server</w:t>
-      </w:r>
-    </w:p>
-    <w:p>
-      <w:r>
-        <w:t>                    } else {</w:t>
-      </w:r>
-    </w:p>
-    <w:p>
-      <w:r>
-        <w:t>                        totalDisplay.innerHTML = new Intl.NumberFormat('vi-VN').format(originalTotal) + ' VND';</w:t>
-      </w:r>
-    </w:p>
-    <w:p>
-      <w:r>
-        <w:t>                        totalInput.value = originalTotal;</w:t>
-      </w:r>
-    </w:p>
-    <w:p>
-      <w:r>
-        <w:t>                        pointsInput.value = 0;</w:t>
-      </w:r>
-    </w:p>
-    <w:p>
-      <w:r>
-        <w:t>                    }</w:t>
-      </w:r>
-    </w:p>
-    <w:p>
-      <w:r>
-        <w:t>                }</w:t>
-      </w:r>
-    </w:p>
-    <w:p>
-      <w:r>
-        <w:t>            &lt;/script&gt;</w:t>
-      </w:r>
-    </w:p>
-    <w:p>
-      <w:r>
         <w:t xml:space="preserve">            </w:t>
       </w:r>
     </w:p>
     <w:p>
       <w:r>
-        <w:t>            &lt;div style="margin-top: 15px; text-align: center; font-size: 12px; color: #888;"&gt;</w:t>
-      </w:r>
-    </w:p>
-    <w:p>
-      <w:r>
-        <w:t>                Bằng việc đặt hàng, bạn đồng ý với &lt;a href="#" style="color: #2ecc71;"&gt;Điều khoản sử dụng&lt;/a&gt; của Yuumi Shop.</w:t>
-      </w:r>
-    </w:p>
-    <w:p>
-      <w:r>
-        <w:t>            &lt;/div&gt;</w:t>
-      </w:r>
-    </w:p>
-    <w:p>
-      <w:r>
-        <w:t>        &lt;/div&gt;</w:t>
-      </w:r>
-    </w:p>
-    <w:p/>
-    <w:p>
-      <w:r>
-        <w:t>    &lt;/form&gt;</w:t>
-      </w:r>
-    </w:p>
-    <w:p>
-      <w:r>
-        <w:t>&lt;/div&gt;</w:t>
+        <w:t>            // Format tiền Việt Nam</w:t>
+      </w:r>
+    </w:p>
+    <w:p>
+      <w:r>
+        <w:t>            totalDisplay.innerHTML = new Intl.NumberFormat('vi-VN').format(newTotal) + ' VND';</w:t>
+      </w:r>
+    </w:p>
+    <w:p>
+      <w:r>
+        <w:t>            totalDisplay.innerHTML += ` &lt;br&gt;&lt;small style='color:green; font-size:12px; font-weight:normal'&gt;(Đã giảm -${new Intl.NumberFormat('vi-VN').format(discount)}đ)&lt;/small&gt;`;</w:t>
+      </w:r>
+    </w:p>
+    <w:p>
+      <w:r>
+        <w:t xml:space="preserve">            </w:t>
+      </w:r>
+    </w:p>
+    <w:p>
+      <w:r>
+        <w:t>            totalInput.value = newTotal;</w:t>
+      </w:r>
+    </w:p>
+    <w:p>
+      <w:r>
+        <w:t xml:space="preserve">            pointsInput.value = usablePoints; </w:t>
+      </w:r>
+    </w:p>
+    <w:p>
+      <w:r>
+        <w:t>        } else {</w:t>
+      </w:r>
+    </w:p>
+    <w:p>
+      <w:r>
+        <w:t>            totalDisplay.innerHTML = new Intl.NumberFormat('vi-VN').format(originalTotal) + ' VND';</w:t>
+      </w:r>
+    </w:p>
+    <w:p>
+      <w:r>
+        <w:t>            totalInput.value = originalTotal;</w:t>
+      </w:r>
+    </w:p>
+    <w:p>
+      <w:r>
+        <w:t>            pointsInput.value = 0;</w:t>
+      </w:r>
+    </w:p>
+    <w:p>
+      <w:r>
+        <w:t>        }</w:t>
+      </w:r>
+    </w:p>
+    <w:p>
+      <w:r>
+        <w:t>    }</w:t>
+      </w:r>
+    </w:p>
+    <w:p>
+      <w:r>
+        <w:t>&lt;/script&gt;</w:t>
+      </w:r>
+    </w:p>
+    <w:p/>
+    <w:p>
+      <w:r>
+        <w:t>&lt;style&gt;</w:t>
+      </w:r>
+    </w:p>
+    <w:p>
+      <w:r>
+        <w:t>.back-link {</w:t>
+      </w:r>
+    </w:p>
+    <w:p>
+      <w:r>
+        <w:t xml:space="preserve">    </w:t>
+      </w:r>
+      <w:r>
+        <w:rPr>
+          <w:i/>
+          <w:iCs/>
+        </w:rPr>
+        <w:t>display</w:t>
+      </w:r>
+      <w:r>
+        <w:t>: inline-block;</w:t>
+      </w:r>
+    </w:p>
+    <w:p>
+      <w:r>
+        <w:t xml:space="preserve">    </w:t>
+      </w:r>
+      <w:r>
+        <w:rPr>
+          <w:i/>
+          <w:iCs/>
+        </w:rPr>
+        <w:t>margin-top</w:t>
+      </w:r>
+      <w:r>
+        <w:t>: 20px;</w:t>
+      </w:r>
+    </w:p>
+    <w:p>
+      <w:r>
+        <w:t xml:space="preserve">    </w:t>
+      </w:r>
+      <w:r>
+        <w:rPr>
+          <w:i/>
+          <w:iCs/>
+        </w:rPr>
+        <w:t>color</w:t>
+      </w:r>
+      <w:r>
+        <w:t>: #666;</w:t>
+      </w:r>
+    </w:p>
+    <w:p>
+      <w:r>
+        <w:t xml:space="preserve">    </w:t>
+      </w:r>
+      <w:r>
+        <w:rPr>
+          <w:i/>
+          <w:iCs/>
+        </w:rPr>
+        <w:t>text-decoration</w:t>
+      </w:r>
+      <w:r>
+        <w:t>: none;</w:t>
+      </w:r>
+    </w:p>
+    <w:p>
+      <w:r>
+        <w:t xml:space="preserve">    </w:t>
+      </w:r>
+      <w:r>
+        <w:rPr>
+          <w:i/>
+          <w:iCs/>
+        </w:rPr>
+        <w:t>transition</w:t>
+      </w:r>
+      <w:r>
+        <w:t>: 0.2s;</w:t>
+      </w:r>
+    </w:p>
+    <w:p>
+      <w:r>
+        <w:t>}</w:t>
+      </w:r>
+    </w:p>
+    <w:p/>
+    <w:p>
+      <w:r>
+        <w:t>.back-link:hover {</w:t>
+      </w:r>
+    </w:p>
+    <w:p>
+      <w:r>
+        <w:t xml:space="preserve">    </w:t>
+      </w:r>
+      <w:r>
+        <w:rPr>
+          <w:i/>
+          <w:iCs/>
+        </w:rPr>
+        <w:t>color</w:t>
+      </w:r>
+      <w:r>
+        <w:t>: #2ecc71;</w:t>
+      </w:r>
+    </w:p>
+    <w:p>
+      <w:r>
+        <w:t>}</w:t>
+      </w:r>
+    </w:p>
+    <w:p>
+      <w:r>
+        <w:t>&lt;/style&gt;</w:t>
       </w:r>
     </w:p>
     <w:p/>
@@ -5090,7 +5248,6 @@
         <w:t>&lt;/html&gt;</w:t>
       </w:r>
     </w:p>
-    <w:p/>
     <w:p/>
     <w:p>
       <w:pPr>
@@ -5809,7 +5966,7 @@
     </w:p>
     <w:p>
       <w:r>
-        <w:t>                     &lt;a href="cart.php" style="color: #666; text-decoration: none;"&gt;&amp;larr; Hủy thanh toán, quay lại giỏ hàng&lt;/a&gt;</w:t>
+        <w:t>                     &lt;a href="cart.php" class="back-link"&gt;&amp;larr; Hủy thanh toán, quay lại giỏ hàng&lt;/a&gt;</w:t>
       </w:r>
     </w:p>
     <w:p>
@@ -5901,6 +6058,113 @@
     <w:p>
       <w:r>
         <w:t>    &lt;/div&gt;</w:t>
+      </w:r>
+    </w:p>
+    <w:p/>
+    <w:p>
+      <w:r>
+        <w:t>    &lt;style&gt;</w:t>
+      </w:r>
+    </w:p>
+    <w:p>
+      <w:r>
+        <w:t>        .back-link{</w:t>
+      </w:r>
+    </w:p>
+    <w:p>
+      <w:r>
+        <w:t xml:space="preserve">            </w:t>
+      </w:r>
+      <w:r>
+        <w:rPr>
+          <w:i/>
+          <w:iCs/>
+        </w:rPr>
+        <w:t>display</w:t>
+      </w:r>
+      <w:r>
+        <w:t>: inline-block;</w:t>
+      </w:r>
+    </w:p>
+    <w:p>
+      <w:r>
+        <w:t xml:space="preserve">            </w:t>
+      </w:r>
+      <w:r>
+        <w:rPr>
+          <w:i/>
+          <w:iCs/>
+        </w:rPr>
+        <w:t>color</w:t>
+      </w:r>
+      <w:r>
+        <w:t>: #666;</w:t>
+      </w:r>
+    </w:p>
+    <w:p>
+      <w:r>
+        <w:t xml:space="preserve">            </w:t>
+      </w:r>
+      <w:r>
+        <w:rPr>
+          <w:i/>
+          <w:iCs/>
+        </w:rPr>
+        <w:t>text-decoration</w:t>
+      </w:r>
+      <w:r>
+        <w:t>: none;</w:t>
+      </w:r>
+    </w:p>
+    <w:p>
+      <w:r>
+        <w:t xml:space="preserve">            </w:t>
+      </w:r>
+      <w:r>
+        <w:rPr>
+          <w:i/>
+          <w:iCs/>
+        </w:rPr>
+        <w:t>transition</w:t>
+      </w:r>
+      <w:r>
+        <w:t>: 0.2s;</w:t>
+      </w:r>
+    </w:p>
+    <w:p>
+      <w:r>
+        <w:t>        }</w:t>
+      </w:r>
+    </w:p>
+    <w:p/>
+    <w:p>
+      <w:r>
+        <w:t>        .back-link:hover{</w:t>
+      </w:r>
+    </w:p>
+    <w:p>
+      <w:r>
+        <w:t xml:space="preserve">            </w:t>
+      </w:r>
+      <w:r>
+        <w:rPr>
+          <w:i/>
+          <w:iCs/>
+        </w:rPr>
+        <w:t>color</w:t>
+      </w:r>
+      <w:r>
+        <w:t>: #2ecc71;</w:t>
+      </w:r>
+    </w:p>
+    <w:p>
+      <w:r>
+        <w:t>        }</w:t>
+      </w:r>
+    </w:p>
+    <w:p>
+      <w:r>
+        <w:t>    &lt;/style&gt;</w:t>
       </w:r>
     </w:p>
     <w:p>
@@ -6621,7 +6885,7 @@
     </w:p>
     <w:p>
       <w:r>
-        <w:t>                                &lt;p style="font-size: 12px; color: #777; margin: 2px 0;"&gt;SL: &lt;?= $row['quantity'] ?&gt;&lt;/p&gt;</w:t>
+        <w:t>                                &lt;p style="font-size: 12px; color: #777; margin: 2px 0;"&gt;Số lượng: &lt;?= $row['quantity'] ?&gt;&lt;/p&gt;</w:t>
       </w:r>
     </w:p>
     <w:p>
@@ -13307,12 +13571,12 @@
     <w:p/>
     <w:p>
       <w:r>
-        <w:t>                    &lt;div class="qty-control-wrapper"&gt;</w:t>
-      </w:r>
-    </w:p>
-    <w:p>
-      <w:r>
-        <w:t>                        &lt;form method="POST" action="cart.php" style="display:inline;"&gt;</w:t>
+        <w:t>                    &lt;div class="qty-control-wrapper" style="margin-right: 35px"&gt;</w:t>
+      </w:r>
+    </w:p>
+    <w:p>
+      <w:r>
+        <w:t>                        &lt;form method="POST" action="cart.php" style="display: inline;"&gt;</w:t>
       </w:r>
     </w:p>
     <w:p>
@@ -32098,7 +32362,7 @@
         <w:t>border-radius</w:t>
       </w:r>
       <w:r>
-        <w:t xml:space="preserve">: 8px; </w:t>
+        <w:t xml:space="preserve">: 50px; </w:t>
       </w:r>
       <w:r>
         <w:rPr>

</xml_diff>

<commit_message>
cập nhật cơ sở dữ liệu
</commit_message>
<xml_diff>
--- a/Yuumishop.docx
+++ b/Yuumishop.docx
@@ -1461,17 +1461,7 @@
     </w:p>
     <w:p>
       <w:r>
-        <w:t xml:space="preserve">    is_new </w:t>
-      </w:r>
-      <w:r>
-        <w:rPr>
-          <w:i/>
-          <w:iCs/>
-        </w:rPr>
-        <w:t>BOOLEAN</w:t>
-      </w:r>
-      <w:r>
-        <w:t xml:space="preserve"> DEFAULT 1,</w:t>
+        <w:t>    is_new BOOLEAN DEFAULT 1,</w:t>
       </w:r>
     </w:p>
     <w:p>
@@ -2093,32 +2083,32 @@
     </w:p>
     <w:p>
       <w:r>
-        <w:t>(201, 'Royal Canin Mini Puppy', 'dog', 'food', 'dry', 'Royal Canin', 'baby', 'unisex', 180000, 200000, 'dogs/food_rc_puppy.jpg', 'Dinh dưỡng cho chó con.', 5, 120),</w:t>
-      </w:r>
-    </w:p>
-    <w:p>
-      <w:r>
-        <w:t>(202, 'Pedigree Adult Vị Bò', 'dog', 'food', 'wet', 'Pedigree', 'adult', 'unisex', 35000, 0, 'dogs/food_pedigree.jpg', 'Pate bò thơm ngon.', 4.5, 500),</w:t>
-      </w:r>
-    </w:p>
-    <w:p>
-      <w:r>
-        <w:t>(203, 'SmartHeart Power Pack', 'dog', 'food', 'dry', 'SmartHeart', 'adult', 'unisex', 450000, 500000, 'dogs/food_smartheart.jpg', 'Tăng cơ bắp cho chó.', 4, 80),</w:t>
-      </w:r>
-    </w:p>
-    <w:p>
-      <w:r>
-        <w:t>(204, 'Whiskas Mèo Con Vị Cá', 'cat', 'food', 'dry', 'Whiskas', 'baby', 'unisex', 110000, 130000, 'cats/food_whiskas_kitten.jpg', 'Dinh dưỡng cho mèo con.', 4.8, 300),</w:t>
-      </w:r>
-    </w:p>
-    <w:p>
-      <w:r>
-        <w:t>(205, 'Pate Royal Canin', 'cat', 'food', 'wet', 'Royal Canin', 'adult', 'unisex', 45000, 0, 'cats/food_rc_pate.jpg', 'Pate cao cấp.', 5, 1000),</w:t>
-      </w:r>
-    </w:p>
-    <w:p>
-      <w:r>
-        <w:t>(206, 'Hạt Me-O Vị Cá Ngừ', 'cat', 'food', 'dry', 'Me-O', 'adult', 'unisex', 90000, 0, 'cats/food_meo.jpg', 'Vị cá ngừ hấp dẫn.', 4.2, 200),</w:t>
+        <w:t>(201, 'Royal Canin Mini Puppy', 'dog', 'food', 'dry', 'Royal Canin', 'baby', 'unisex', 180000, 200000, 'food/food_rc_puppy.jpg', 'Dinh dưỡng cho chó con.', 5, 120),</w:t>
+      </w:r>
+    </w:p>
+    <w:p>
+      <w:r>
+        <w:t>(202, 'Pedigree Adult Vị Bò', 'dog', 'food', 'wet', 'Pedigree', 'adult', 'unisex', 35000, 0, 'food/food_pedigree.jpg', 'Pate bò thơm ngon.', 4.5, 500),</w:t>
+      </w:r>
+    </w:p>
+    <w:p>
+      <w:r>
+        <w:t>(203, 'SmartHeart Power Pack', 'dog', 'food', 'dry', 'SmartHeart', 'adult', 'unisex', 450000, 500000, 'food/food_smartheart.jpg', 'Tăng cơ bắp cho chó.', 4, 80),</w:t>
+      </w:r>
+    </w:p>
+    <w:p>
+      <w:r>
+        <w:t>(204, 'Whiskas Mèo Con Vị Cá', 'cat', 'food', 'dry', 'Whiskas', 'baby', 'unisex', 110000, 130000, 'food/food_whiskas_kitten.jpg', 'Dinh dưỡng cho mèo con.', 4.8, 300),</w:t>
+      </w:r>
+    </w:p>
+    <w:p>
+      <w:r>
+        <w:t>(205, 'Pate Royal Canin', 'cat', 'food', 'wet', 'Royal Canin', 'adult', 'unisex', 45000, 0, 'food/food_rc_pate.jpg', 'Pate cao cấp.', 5, 1000),</w:t>
+      </w:r>
+    </w:p>
+    <w:p>
+      <w:r>
+        <w:t>(206, 'Hạt Me-O Vị Cá Ngừ', 'cat', 'food', 'dry', 'Me-O', 'adult', 'unisex', 90000, 0, 'food/food_meo.jpg', 'Vị cá ngừ hấp dẫn.', 4.2, 200),</w:t>
       </w:r>
     </w:p>
     <w:p/>
@@ -2129,12 +2119,12 @@
     </w:p>
     <w:p>
       <w:r>
-        <w:t>(301, 'Cát Vệ Sinh Nhật Bản 5L', 'cat', 'accessory', 'hygiene', 'OEM', 'all', 'unisex', 60000, 80000, 'cats/cat_litter.jpg', 'Khử mùi tốt.', 4.9, 2000),</w:t>
-      </w:r>
-    </w:p>
-    <w:p>
-      <w:r>
-        <w:t>(302, 'Sữa Tắm SOS Cho Chó', 'dog', 'accessory', 'hygiene', 'SOS', 'all', 'unisex', 120000, 0, 'dogs/shampoo_sos.jpg', 'Lưu hương lâu.', 4.7, 150),</w:t>
+        <w:t>(301, 'Cát Vệ Sinh Nhật Bản 5L', 'cat', 'accessory', 'hygiene', 'OEM', 'all', 'unisex', 60000, 80000, 'health/cat_litter.jpg', 'Khử mùi tốt.', 4.9, 2000),</w:t>
+      </w:r>
+    </w:p>
+    <w:p>
+      <w:r>
+        <w:t>(302, 'Sữa Tắm SOS Cho Chó', 'dog', 'accessory', 'hygiene', 'SOS', 'all', 'unisex', 120000, 0, 'health/shampoo_sos.jpg', 'Lưu hương lâu.', 4.7, 150),</w:t>
       </w:r>
     </w:p>
     <w:p>
@@ -2144,17 +2134,17 @@
     </w:p>
     <w:p>
       <w:r>
-        <w:t>(304, 'Chuồng Sắt Tĩnh Điện', 'dog', 'cage', 'cage', 'OEM', 'all', 'unisex', 850000, 1000000, 'dogs/cage_big.jpg', 'Bền đẹp chắc chắn.', 5, 10),</w:t>
-      </w:r>
-    </w:p>
-    <w:p>
-      <w:r>
-        <w:t>(305, 'Cần Câu Mèo Lông Vũ', 'cat', 'toy', 'toy', 'OEM', 'all', 'unisex', 25000, 0, 'cats/toy_cancau.jpg', 'Đồ chơi tương tác.', 4.8, 500),</w:t>
-      </w:r>
-    </w:p>
-    <w:p>
-      <w:r>
-        <w:t>(306, 'Xương Gặm Sạch Răng', 'dog', 'food', 'treat', 'Goodies', 'all', 'unisex', 30000, 0, 'dogs/treat_bone.jpg', 'Làm sạch răng.', 4.6, 300);</w:t>
+        <w:t>(304, 'Chuồng Sắt Tĩnh Điện', 'dog', 'cage', 'cage', 'OEM', 'all', 'unisex', 850000, 1000000, 'accessory/cage_big.jpg', 'Bền đẹp chắc chắn.', 5, 10),</w:t>
+      </w:r>
+    </w:p>
+    <w:p>
+      <w:r>
+        <w:t>(305, 'Cần Câu Mèo Lông Vũ', 'cat', 'toy', 'toy', 'OEM', 'all', 'unisex', 25000, 0, 'toy/toy_cancau.jpg', 'Đồ chơi tương tác.', 4.8, 500),</w:t>
+      </w:r>
+    </w:p>
+    <w:p>
+      <w:r>
+        <w:t>(306, 'Xương Gặm Sạch Răng', 'dog', 'food', 'treat', 'Goodies', 'all', 'unisex', 30000, 0, 'toy/treat_bone.jpg', 'Làm sạch răng.', 4.6, 300);</w:t>
       </w:r>
     </w:p>
     <w:p>

</xml_diff>

<commit_message>
update code lên word
</commit_message>
<xml_diff>
--- a/Yuumishop.docx
+++ b/Yuumishop.docx
@@ -12927,46 +12927,7 @@
         <w:t>                &lt;/div&gt;</w:t>
       </w:r>
     </w:p>
-    <w:p>
-      <w:r>
-        <w:t>                &lt;div class="sidebar-section"&gt;</w:t>
-      </w:r>
-    </w:p>
-    <w:p>
-      <w:r>
-        <w:t>                    &lt;h3&gt;&lt;i class="fas fa-tag"&gt;&lt;/i&gt; Thương hiệu&lt;/h3&gt;</w:t>
-      </w:r>
-    </w:p>
-    <w:p>
-      <w:r>
-        <w:t>                    &lt;div class="filter-list"&gt;</w:t>
-      </w:r>
-    </w:p>
-    <w:p>
-      <w:r>
-        <w:t>                        &lt;label&gt;&lt;input type="radio" name="brand" value="" &lt;?= empty($_GET['brand'])?'checked':'' ?&gt; onchange="this.form.submit()"&gt; Tất cả&lt;/label&gt;</w:t>
-      </w:r>
-    </w:p>
-    <w:p>
-      <w:r>
-        <w:t>                        &lt;label&gt;&lt;input type="radio" name="brand" value="Royal Canin" &lt;?= (isset($_GET['brand']) &amp;&amp; $_GET['brand']=='Royal Canin')?'checked':'' ?&gt; onchange="this.form.submit()"&gt; Royal Canin&lt;/label&gt;</w:t>
-      </w:r>
-    </w:p>
-    <w:p>
-      <w:r>
-        <w:t>                        &lt;label&gt;&lt;input type="radio" name="brand" value="Whiskas" &lt;?= (isset($_GET['brand']) &amp;&amp; $_GET['brand']=='Whiskas')?'checked':'' ?&gt; onchange="this.form.submit()"&gt; Whiskas&lt;/label&gt;</w:t>
-      </w:r>
-    </w:p>
-    <w:p>
-      <w:r>
-        <w:t>                    &lt;/div&gt;</w:t>
-      </w:r>
-    </w:p>
-    <w:p>
-      <w:r>
-        <w:t>                &lt;/div&gt;</w:t>
-      </w:r>
-    </w:p>
+    <w:p/>
     <w:p>
       <w:r>
         <w:t>            &lt;?php endif; ?&gt;</w:t>

</xml_diff>

<commit_message>
thêm sản phẩm mới vào cửa hàng
</commit_message>
<xml_diff>
--- a/Yuumishop.docx
+++ b/Yuumishop.docx
@@ -2271,7 +2271,105 @@
     </w:p>
     <w:p>
       <w:r>
-        <w:t>(316, 'Balo Phi Hành Gia', 'cat', 'accessory', 'carrier', 'OEM', 'all', 'unisex', 350000, 400000, 'accessory/balo_phi_hanh_gia.jpg', 'Balo vận chuyển chó mèo tiện lợi.', 4.8, 15);</w:t>
+        <w:t>(316, 'Balo Phi Hành Gia', 'cat', 'accessory', 'carrier', 'OEM', 'all', 'unisex', 350000, 400000, 'accessory/balo_phi_hanh_gia.jpg', 'Balo vận chuyển chó mèo tiện lợi.', 4.8, 15),</w:t>
+      </w:r>
+    </w:p>
+    <w:p/>
+    <w:p>
+      <w:r>
+        <w:t>-- Sản phẩm Y tế - Dành cho Chó/Mèo</w:t>
+      </w:r>
+    </w:p>
+    <w:p>
+      <w:r>
+        <w:t>(317, 'Vaccine Phòng Dại Nobivac Rabies', 'dog', 'health', 'vaccine', 'Merck', 'all', 'unisex', 250000, 0, 'health/vaccine_rabies.jpg', 'Vaccine phòng dại an toàn, hiệu quả cao, bảo vệ 1 năm.', 4.9, 80),</w:t>
+      </w:r>
+    </w:p>
+    <w:p>
+      <w:r>
+        <w:t>(318, 'Thuốc Xổ Giun Bayer Drontal', 'cat', 'health', 'deworm', 'Bayer', 'all', 'unisex', 80000, 95000, 'health/thuoc_xo_giun.jpg', 'Thuốc xổ giun toàn diện cho mèo, an toàn, dễ sử dụng.', 4.7, 200),</w:t>
+      </w:r>
+    </w:p>
+    <w:p>
+      <w:r>
+        <w:t>(319, 'Dầu Gội Kháng Khuẩn Malaseb', 'dog', 'health', 'shampoo', 'Dermcare', 'all', 'unisex', 180000, 0, 'health/shampoo_khang_khuan.jpg', 'Dầu gội đặc trị viêm da, nấm ngứa, mẩn đỏ.', 4.8, 45),</w:t>
+      </w:r>
+    </w:p>
+    <w:p>
+      <w:r>
+        <w:t>(320, 'Băng Gạc Thú Y Self-adhesive', 'all', 'health', 'first_aid', 'OEM', 'all', 'unisex', 35000, 0, 'health/bang_gac_thu_y.jpg', 'Băng gạc tự dính, không dính lông, dễ thay.', 4.5, 120),</w:t>
+      </w:r>
+    </w:p>
+    <w:p>
+      <w:r>
+        <w:t>(321, 'Nước Răng Miệng cho Chó Tropiclean', 'dog', 'health', 'dental', 'Tropiclean', 'all', 'unisex', 120000, 150000, 'health/nuoc_ranh_mieng.jpg', 'Giảm mảng bám, hôi miệng, an toàn khi nuốt.', 4.6, 90),</w:t>
+      </w:r>
+    </w:p>
+    <w:p>
+      <w:r>
+        <w:t>(322, 'Kem Dưỡng Móng &amp; Da Paw Balm', 'all', 'health', 'skin_care', 'OEM', 'all', 'unisex', 65000, 0, 'health/kem_duong_mong.jpg', 'Kem dưỡng ẩm móng, da chân, chống nứt nẻ.', 4.4, 60),</w:t>
+      </w:r>
+    </w:p>
+    <w:p/>
+    <w:p>
+      <w:r>
+        <w:t>-- Sản phẩm Đồ chơi</w:t>
+      </w:r>
+    </w:p>
+    <w:p>
+      <w:r>
+        <w:t>(323, 'Bóng Tennis có Dây Đàn Hồi', 'dog', 'toy', 'ball', 'OEM', 'all', 'unisex', 45000, 0, 'toy/bong_tennis_day.jpg', 'Bóng tennis gắn dây đàn hồi, chơi một mình hoặc cùng chủ.', 4.8, 150),</w:t>
+      </w:r>
+    </w:p>
+    <w:p>
+      <w:r>
+        <w:t>(324, 'Máy Bắn Bóng Bi Tự Động cho Mèo', 'cat', 'toy', 'interactive_toy', 'OEM', 'all', 'unisex', 185000, 0, 'toy/may_ban_bong_bi.jpg', 'Máy tự động bắn bóng bi, kích thích mèo vận động, chống buồn chán.', 4.7, 65),</w:t>
+      </w:r>
+    </w:p>
+    <w:p>
+      <w:r>
+        <w:t>(325, 'Đồ Chơi Thông Minh Puzzle Feeder cho Chó', 'dog', 'toy', 'puzzle_toy', 'Nina Ottosson', 'all', 'unisex', 220000, 0, 'toy/puzzle_feeder.jpg', 'Đồ chơi thử thách trí tuệ, giúp chó giải đố để lấy thức ăn, chống buồn chán.', 4.9, 75),</w:t>
+      </w:r>
+    </w:p>
+    <w:p>
+      <w:r>
+        <w:t>(326, 'Lồng 3 Tầng Cao Cấp cho Mèo', 'cat', 'cage', 'multi_level', 'OEM', 'all', 'unisex', 850000, 950000, 'toy/long_meo_3_tang.jpg', 'Lồng 3 tầng với cột cào móng, giường ngủ, đồ chơi treo, không gian thoáng mát cho mèo vui chơi và nghỉ ngơi.', 4.9, 40),</w:t>
+      </w:r>
+    </w:p>
+    <w:p>
+      <w:r>
+        <w:t>(327, 'Đĩa Bay Ném cho Chó', 'dog', 'toy', 'frisbee', 'OEM', 'all', 'unisex', 75000, 0, 'toy/dia_bay_nem.jpg', 'Đĩa bay nhựa dẻo, nhẹ, bay xa, chơi ngoài trời.', 4.6, 75),</w:t>
+      </w:r>
+    </w:p>
+    <w:p/>
+    <w:p>
+      <w:r>
+        <w:t>-- Sản phẩm Phụ kiện</w:t>
+      </w:r>
+    </w:p>
+    <w:p>
+      <w:r>
+        <w:t>(328, 'Vòng Cổ LED Phát Sáng Đa Màu', 'dog', 'accessory', 'collar', 'OEM', 'all', 'unisex', 95000, 120000, 'accessory/vong_co_led.jpg', 'Vòng cổ LED chống nước, sáng đêm, an toàn khi đi dạo.', 4.8, 60),</w:t>
+      </w:r>
+    </w:p>
+    <w:p>
+      <w:r>
+        <w:t>(329, 'Balo Vận Chuyển Thông Minh', 'cat', 'accessory', 'carrier', 'OEM', 'all', 'unisex', 320000, 0, 'accessory/balo_thong_minh.jpg', 'Balo có cửa sổ lưới, túi đựng đồ, đệm lót êm ái.', 4.9, 40),</w:t>
+      </w:r>
+    </w:p>
+    <w:p>
+      <w:r>
+        <w:t>(330, 'Yếm Ăn Chống Vấy Bẩn', 'all', 'accessory', 'bib', 'OEM', 'all', 'unisex', 45000, 0, 'accessory/yem_an_chong_vay.jpg', 'Yếm ăn chống thấm, dễ giặt, bảo vệ lông khi ăn uống.', 4.5, 180),</w:t>
+      </w:r>
+    </w:p>
+    <w:p>
+      <w:r>
+        <w:t>(331, 'Dây Dắt Thông Minh Tự Cuốn', 'dog', 'accessory', 'leash', 'OEM', 'all', 'unisex', 140000, 0, 'accessory/day_dat_tu_cuon.jpg', 'Dây dắt tự cuốn 5m, nút khóa an toàn, tay cầm êm.', 4.7, 55),</w:t>
+      </w:r>
+    </w:p>
+    <w:p>
+      <w:r>
+        <w:t>(332, 'Áo Phao Cứu Sinh cho Chó Mèo Đi Bơi', 'all', 'accessory', 'life_vest', 'OEM', 'all', 'unisex', 150000, 180000, 'accessory/ao_phao_cuu_sinh.jpg', 'Áo phao cứu sinh chống nước, có dây an toàn và đai phản quang, bảo vệ thú cưng khi đi bơi hoặc du thuyền.', 4.7, 55);</w:t>
       </w:r>
     </w:p>
     <w:p/>
@@ -6121,34 +6219,81 @@
     </w:p>
     <w:p>
       <w:r>
-        <w:t>                &lt;div class="bank-grid"&gt;</w:t>
-      </w:r>
-    </w:p>
-    <w:p>
-      <w:r>
-        <w:t>                    &lt;div class="bank-item"&gt;&lt;img src="https://static.wixstatic.com/media/9d8ed5_b92082f54b6143f6bacafff11d0c1d98~mv2.png/v1/fit/w_500,h_500,q_90/file.png" alt="MB"&gt;&lt;/div&gt;</w:t>
-      </w:r>
-    </w:p>
-    <w:p>
-      <w:r>
-        <w:t>                    &lt;div class="bank-item"&gt;&lt;img src="https://doozypack.vn/wp-content/uploads/2025/09/logo-techcombank-vector-3.jpg" alt="Techcom"&gt;&lt;/div&gt;</w:t>
-      </w:r>
-    </w:p>
-    <w:p>
-      <w:r>
-        <w:t>                    &lt;div class="bank-item"&gt;&lt;img src="https://hienlaptop.com/wp-content/uploads/2024/12/logo-vietcombank-vector-11.png" alt="VCB"&gt;&lt;/div&gt;</w:t>
-      </w:r>
-    </w:p>
-    <w:p>
-      <w:r>
-        <w:t>                    &lt;div class="bank-item"&gt;&lt;img src="https://taitailieu.net/wp-content/uploads/2025/10/bidv-logo-4.jpg" alt="BIDV"&gt;&lt;/div&gt;</w:t>
-      </w:r>
-    </w:p>
-    <w:p>
-      <w:r>
-        <w:t>                &lt;/div&gt;</w:t>
-      </w:r>
-    </w:p>
+        <w:t>                    &lt;div class="bank-grid"&gt;</w:t>
+      </w:r>
+    </w:p>
+    <w:p>
+      <w:r>
+        <w:t>                        &lt;div class="bank-item"&gt;&lt;img src="https://static.wixstatic.com/media/9d8ed5_b92082f54b6143f6bacafff11d0c1d98~mv2.png/v1/fit/w_500,h_500,q_90/file.png" alt="MB"&gt;&lt;/div&gt;</w:t>
+      </w:r>
+    </w:p>
+    <w:p>
+      <w:r>
+        <w:t>                        &lt;div class="bank-item"&gt;&lt;img src="https://doozypack.vn/wp-content/uploads/2025/09/logo-techcombank-vector-3.jpg" alt="Techcom"&gt;&lt;/div&gt;</w:t>
+      </w:r>
+    </w:p>
+    <w:p>
+      <w:r>
+        <w:t>                        &lt;div class="bank-item"&gt;&lt;img src="https://hienlaptop.com/wp-content/uploads/2024/12/logo-vietcombank-vector-11.png" alt="VCB"&gt;&lt;/div&gt;</w:t>
+      </w:r>
+    </w:p>
+    <w:p>
+      <w:r>
+        <w:t>                        &lt;div class="bank-item"&gt;&lt;img src="https://taitailieu.net/wp-content/uploads/2025/10/bidv-logo-4.jpg" alt="BIDV"&gt;&lt;/div&gt;</w:t>
+      </w:r>
+    </w:p>
+    <w:p>
+      <w:r>
+        <w:t xml:space="preserve">                        </w:t>
+      </w:r>
+    </w:p>
+    <w:p>
+      <w:r>
+        <w:t>                        &lt;div class="bank-item"&gt;&lt;img src="https://cdn.haitrieu.com/wp-content/uploads/2022/01/Logo-VietinBank-CTG-Ori.png" alt="VietinBank"&gt;&lt;/div&gt;</w:t>
+      </w:r>
+    </w:p>
+    <w:p>
+      <w:r>
+        <w:t>                        &lt;div class="bank-item"&gt;&lt;img src="https://static.wixstatic.com/media/9d8ed5_4e857f9bd2dd4e35894dcce89168fc74~mv2.png/v1/fill/w_560,h_560,al_c,q_85,usm_0.66_1.00_0.01,enc_avif,quality_auto/9d8ed5_4e857f9bd2dd4e35894dcce89168fc74~mv2.png" alt="VIB"&gt;&lt;/div&gt;</w:t>
+      </w:r>
+    </w:p>
+    <w:p>
+      <w:r>
+        <w:t>                        &lt;div class="bank-item"&gt;&lt;img src="https://static.wixstatic.com/media/9d8ed5_9b46446656b14efc88b058399cd81d9a~mv2.png/v1/fill/w_560,h_560,al_c,q_85,usm_0.66_1.00_0.01,enc_avif,quality_auto/9d8ed5_9b46446656b14efc88b058399cd81d9a~mv2.png" alt="TPBank"&gt;&lt;/div&gt;</w:t>
+      </w:r>
+    </w:p>
+    <w:p>
+      <w:r>
+        <w:t>                        &lt;div class="bank-item"&gt;&lt;img src="https://cdn.haitrieu.com/wp-content/uploads/2022/01/Logo-ACB-Ori.png" alt="ACB"&gt;&lt;/div&gt;</w:t>
+      </w:r>
+    </w:p>
+    <w:p/>
+    <w:p>
+      <w:r>
+        <w:t>                        &lt;div class="bank-item"&gt;&lt;img src="https://static.wixstatic.com/media/9d8ed5_c1ff4912d7eb4f8b901802156088483d~mv2.png/v1/fit/w_500,h_500,q_90/file.png" alt="Sacombank"&gt;&lt;/div&gt;</w:t>
+      </w:r>
+    </w:p>
+    <w:p>
+      <w:r>
+        <w:t>                        &lt;div class="bank-item"&gt;&lt;img src="https://dongphucvina.vn/wp-content/uploads/2023/05/logo-scb-dongphucvina.vn1_.png" alt="SCB"&gt;&lt;/div&gt;</w:t>
+      </w:r>
+    </w:p>
+    <w:p>
+      <w:r>
+        <w:t>                        &lt;div class="bank-item"&gt;&lt;img src="https://cdn.haitrieu.com/wp-content/uploads/2022/01/Icon-VPBank.png" alt="VPBank"&gt;&lt;/div&gt;</w:t>
+      </w:r>
+    </w:p>
+    <w:p>
+      <w:r>
+        <w:t>                        &lt;div class="bank-item"&gt;&lt;img src="https://cdn.haitrieu.com/wp-content/uploads/2022/01/Logo-HDBank-Ori.png" alt="HDBank"&gt;&lt;/div&gt;</w:t>
+      </w:r>
+    </w:p>
+    <w:p>
+      <w:r>
+        <w:t>                    &lt;/div&gt;</w:t>
+      </w:r>
+    </w:p>
+    <w:p/>
     <w:p>
       <w:r>
         <w:t>                &lt;p style="margin-top: 20px; font-size: 13px; color: #888;"&gt;Lưu ý: Đây là giao diện giả lập (Demo) phục vụ đồ án. Không thực hiện giao dịch thật.&lt;/p&gt;</w:t>

</xml_diff>

<commit_message>
bỏ underline dưới chữ 'Trang chủ'
</commit_message>
<xml_diff>
--- a/Yuumishop.docx
+++ b/Yuumishop.docx
@@ -38310,21 +38310,6 @@
       </w:r>
       <w:r>
         <w:t>.style.fontWeight = 'bold';</w:t>
-      </w:r>
-    </w:p>
-    <w:p>
-      <w:r>
-        <w:t xml:space="preserve">            </w:t>
-      </w:r>
-      <w:r>
-        <w:rPr>
-          <w:i/>
-          <w:iCs/>
-        </w:rPr>
-        <w:t>link</w:t>
-      </w:r>
-      <w:r>
-        <w:t>.style.textDecoration = 'underline';</w:t>
       </w:r>
     </w:p>
     <w:p>

</xml_diff>